<commit_message>
fix(docs): intro y descripción
</commit_message>
<xml_diff>
--- a/Memoria_Proyecto.docx
+++ b/Memoria_Proyecto.docx
@@ -762,14 +762,19 @@
         <w:rPr>
           <w:rFonts w:eastAsia="Arial"/>
         </w:rPr>
-        <w:t>En un panorama donde estamos rodeados de diferentes negocios de hostelería, Al Punto proporciona ese toque mágico que anima al cliente a volver al local. Esto lo hace mediante un sistema de ofertas personalizado basándose en todos los datos de nuestros usuarios, estos recibirán retornos en puntos que darán acceso a un marketplace en el cual podrán ser usados.</w:t>
+        <w:t>En un panorama donde estamos rodeados de diferentes negocios de hostelería, Al Punto proporciona ese toque mágico que anima al cliente a volver al local. Esto lo hace mediante un sistema de ofertas, estos recibirán retornos en puntos que darán acceso a un marketplac</w:t>
       </w:r>
       <w:r>
         <w:rPr>
           <w:rFonts w:eastAsia="Arial"/>
         </w:rPr>
-        <w:br/>
-        <w:t>La opinión de nuestros clientes es fundamental para nosotros y por ello les proporcionamos las herramientas necesarias para que los clientes se comuniquen de una forma abierta con el local en cuestión.</w:t>
+        <w:t>e en el cual podrán ser usados; además de una sección de reseñas, porque l</w:t>
+      </w:r>
+      <w:r>
+        <w:rPr>
+          <w:rFonts w:eastAsia="Arial"/>
+        </w:rPr>
+        <w:t>a opinión de nuestros clientes es fundamental para nosotros y por ello les proporcionamos las herramientas necesarias para que los clientes se comuniquen de una forma abierta con el local en cuestión.</w:t>
       </w:r>
     </w:p>
     <w:p>
@@ -819,7 +824,19 @@
         <w:rPr>
           <w:rFonts w:eastAsia="Arial"/>
         </w:rPr>
-        <w:t xml:space="preserve">ras haberse registrado se podrá acceder a un panel personal donde se podrá editar la información personal. En este panel </w:t>
+        <w:t xml:space="preserve">ras haberse registrado se podrá acceder a un panel personal donde se podrá </w:t>
+      </w:r>
+      <w:r>
+        <w:rPr>
+          <w:rFonts w:eastAsia="Arial"/>
+        </w:rPr>
+        <w:t>consultar</w:t>
+      </w:r>
+      <w:r>
+        <w:rPr>
+          <w:rFonts w:eastAsia="Arial"/>
+        </w:rPr>
+        <w:t xml:space="preserve"> la información personal. En este panel </w:t>
       </w:r>
       <w:r>
         <w:rPr>
@@ -971,7 +988,19 @@
         <w:rPr>
           <w:rFonts w:eastAsia="Arial"/>
         </w:rPr>
-        <w:t>Para el correcto funcionamiento de la lógica de negocio, se definen cuatro tipos de perfiles:</w:t>
+        <w:t xml:space="preserve">Para el correcto funcionamiento de la lógica de negocio, se definen </w:t>
+      </w:r>
+      <w:r>
+        <w:rPr>
+          <w:rFonts w:eastAsia="Arial"/>
+        </w:rPr>
+        <w:t>tres</w:t>
+      </w:r>
+      <w:r>
+        <w:rPr>
+          <w:rFonts w:eastAsia="Arial"/>
+        </w:rPr>
+        <w:t xml:space="preserve"> tipos de perfiles:</w:t>
       </w:r>
     </w:p>
     <w:p>
@@ -1214,13 +1243,19 @@
         <w:rPr>
           <w:rFonts w:eastAsia="Arial"/>
         </w:rPr>
-        <w:t>ión visual, acceso al menú y al registro o inicio de sesión</w:t>
+        <w:t>ión visual, acceso al menú,</w:t>
       </w:r>
       <w:r>
         <w:rPr>
           <w:rFonts w:eastAsia="Arial"/>
         </w:rPr>
-        <w:t>.</w:t>
+        <w:t xml:space="preserve"> al registro o inicio de sesión</w:t>
+      </w:r>
+      <w:r>
+        <w:rPr>
+          <w:rFonts w:eastAsia="Arial"/>
+        </w:rPr>
+        <w:t>, sección de historia y una recomendación de platos variable.</w:t>
       </w:r>
     </w:p>
     <w:p>
@@ -1717,6 +1752,7 @@
         </w:rPr>
       </w:pPr>
       <w:r>
+        <w:lastRenderedPageBreak/>
         <w:br w:type="page"/>
       </w:r>
     </w:p>
@@ -14693,7 +14729,7 @@
         <w:noProof/>
         <w:color w:val="041C2C"/>
       </w:rPr>
-      <w:t>17</w:t>
+      <w:t>4</w:t>
     </w:r>
     <w:r>
       <w:rPr>
@@ -17784,35 +17820,35 @@
   <a:extraClrSchemeLst/>
   <a:extLst>
     <a:ext uri="{05A4C25C-085E-4340-85A3-A5531E510DB2}">
-      <thm15:themeFamily xmlns="" xmlns:thm15="http://schemas.microsoft.com/office/thememl/2012/main" name="Office Theme" id="{62F939B6-93AF-4DB8-9C6B-D6C7DFDC589F}" vid="{4A3C46E8-61CC-4603-A589-7422A47A8E4A}"/>
+      <thm15:themeFamily xmlns:thm15="http://schemas.microsoft.com/office/thememl/2012/main" xmlns="" name="Office Theme" id="{62F939B6-93AF-4DB8-9C6B-D6C7DFDC589F}" vid="{4A3C46E8-61CC-4603-A589-7422A47A8E4A}"/>
     </a:ext>
   </a:extLst>
 </a:theme>
 </file>
 
 <file path=customXml/item1.xml><?xml version="1.0" encoding="utf-8"?>
+<b:Sources xmlns:b="http://schemas.openxmlformats.org/officeDocument/2006/bibliography" xmlns="http://schemas.openxmlformats.org/officeDocument/2006/bibliography" SelectedStyle="\APA.XSL" StyleName="APA"/>
+</file>
+
+<file path=customXml/item2.xml><?xml version="1.0" encoding="utf-8"?>
 <go:gDocsCustomXmlDataStorage xmlns:go="http://customooxmlschemas.google.com/" xmlns:r="http://schemas.openxmlformats.org/officeDocument/2006/relationships" uri="GoogleDocsCustomDataVersion2">
   <go:docsCustomData xmlns:go="http://customooxmlschemas.google.com/" roundtripDataSignature="AMtx7mhMrOIHQSrRt7VwJAbYZG0rIv/btw==">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</go:docsCustomData>
 </go:gDocsCustomXmlDataStorage>
 </file>
 
-<file path=customXml/item2.xml><?xml version="1.0" encoding="utf-8"?>
-<b:Sources xmlns:b="http://schemas.openxmlformats.org/officeDocument/2006/bibliography" xmlns="http://schemas.openxmlformats.org/officeDocument/2006/bibliography" SelectedStyle="\APA.XSL" StyleName="APA"/>
+<file path=customXml/itemProps1.xml><?xml version="1.0" encoding="utf-8"?>
+<ds:datastoreItem xmlns:ds="http://schemas.openxmlformats.org/officeDocument/2006/customXml" ds:itemID="{86FC890C-C6AE-413D-8D13-8AA4CC75D52D}">
+  <ds:schemaRefs>
+    <ds:schemaRef ds:uri="http://schemas.openxmlformats.org/officeDocument/2006/bibliography"/>
+  </ds:schemaRefs>
+</ds:datastoreItem>
 </file>
 
-<file path=customXml/itemProps1.xml><?xml version="1.0" encoding="utf-8"?>
+<file path=customXml/itemProps2.xml><?xml version="1.0" encoding="utf-8"?>
 <ds:datastoreItem xmlns:ds="http://schemas.openxmlformats.org/officeDocument/2006/customXml" ds:itemID="{11111111-1234-1234-1234-123412341234}">
   <ds:schemaRefs>
     <ds:schemaRef ds:uri="http://customooxmlschemas.google.com/"/>
     <ds:schemaRef ds:uri="http://schemas.openxmlformats.org/officeDocument/2006/relationships"/>
   </ds:schemaRefs>
 </ds:datastoreItem>
-</file>
-
-<file path=customXml/itemProps2.xml><?xml version="1.0" encoding="utf-8"?>
-<ds:datastoreItem xmlns:ds="http://schemas.openxmlformats.org/officeDocument/2006/customXml" ds:itemID="{86FC890C-C6AE-413D-8D13-8AA4CC75D52D}">
-  <ds:schemaRefs>
-    <ds:schemaRef ds:uri="http://schemas.openxmlformats.org/officeDocument/2006/bibliography"/>
-  </ds:schemaRefs>
-</ds:datastoreItem>
 </file>
</xml_diff>

<commit_message>
fix(docs): puntos 3 y 4
</commit_message>
<xml_diff>
--- a/Memoria_Proyecto.docx
+++ b/Memoria_Proyecto.docx
@@ -1444,9 +1444,10 @@
         <w:pStyle w:val="normal0"/>
         <w:numPr>
           <w:ilvl w:val="0"/>
-          <w:numId w:val="3"/>
+          <w:numId w:val="15"/>
         </w:numPr>
         <w:spacing w:after="0" w:line="276" w:lineRule="auto"/>
+        <w:jc w:val="both"/>
       </w:pPr>
       <w:r>
         <w:rPr>
@@ -1494,15 +1495,19 @@
         </w:rPr>
         <w:t>te tras cada consumición pagada y un gráfico de estadísticas que incluye reservas, tickets y puntos.</w:t>
       </w:r>
+      <w:r>
+        <w:t xml:space="preserve"> </w:t>
+      </w:r>
     </w:p>
     <w:p>
       <w:pPr>
         <w:pStyle w:val="normal0"/>
         <w:numPr>
           <w:ilvl w:val="0"/>
-          <w:numId w:val="3"/>
+          <w:numId w:val="15"/>
         </w:numPr>
         <w:spacing w:after="0" w:line="276" w:lineRule="auto"/>
+        <w:jc w:val="both"/>
       </w:pPr>
       <w:r>
         <w:rPr>
@@ -1510,31 +1515,226 @@
           <w:b/>
           <w:bCs/>
         </w:rPr>
-        <w:t>Historial</w:t>
-      </w:r>
+        <w:t>Historial:</w:t>
+      </w:r>
+      <w:r>
+        <w:rPr>
+          <w:rFonts w:eastAsia="Arial"/>
+        </w:rPr>
+        <w:t xml:space="preserve"> registro de reservas, pedidos y </w:t>
+      </w:r>
+      <w:r>
+        <w:rPr>
+          <w:rFonts w:eastAsia="Arial"/>
+        </w:rPr>
+        <w:t>ofertas del marketplace canjeadas</w:t>
+      </w:r>
+      <w:r>
+        <w:rPr>
+          <w:rFonts w:eastAsia="Arial"/>
+        </w:rPr>
+        <w:t>.</w:t>
+      </w:r>
+      <w:r>
+        <w:t xml:space="preserve"> </w:t>
+      </w:r>
+    </w:p>
+    <w:p>
+      <w:pPr>
+        <w:pStyle w:val="normal0"/>
+        <w:numPr>
+          <w:ilvl w:val="0"/>
+          <w:numId w:val="15"/>
+        </w:numPr>
+        <w:spacing w:after="0" w:line="276" w:lineRule="auto"/>
+        <w:jc w:val="both"/>
+      </w:pPr>
       <w:r>
         <w:rPr>
           <w:rFonts w:eastAsia="Arial"/>
           <w:b/>
           <w:bCs/>
         </w:rPr>
+        <w:t>Marketplace:</w:t>
+      </w:r>
+      <w:r>
+        <w:rPr>
+          <w:rFonts w:eastAsia="Arial"/>
+        </w:rPr>
+        <w:t xml:space="preserve"> t</w:t>
+      </w:r>
+      <w:r>
+        <w:rPr>
+          <w:rFonts w:eastAsia="Arial"/>
+        </w:rPr>
+        <w:t>ienda interna donde el usuario puede canjear sus puntos por benefi</w:t>
+      </w:r>
+      <w:r>
+        <w:rPr>
+          <w:rFonts w:eastAsia="Arial"/>
+        </w:rPr>
+        <w:t>cios.</w:t>
+      </w:r>
+      <w:r>
+        <w:rPr>
+          <w:rFonts w:eastAsia="Arial"/>
+        </w:rPr>
+        <w:t xml:space="preserve"> </w:t>
+      </w:r>
+    </w:p>
+    <w:p>
+      <w:pPr>
+        <w:pStyle w:val="normal0"/>
+        <w:numPr>
+          <w:ilvl w:val="0"/>
+          <w:numId w:val="15"/>
+        </w:numPr>
+        <w:spacing w:after="0" w:line="276" w:lineRule="auto"/>
+        <w:jc w:val="both"/>
+      </w:pPr>
+      <w:r>
+        <w:rPr>
+          <w:rFonts w:eastAsia="Arial"/>
+          <w:b/>
+          <w:bCs/>
+        </w:rPr>
+        <w:t xml:space="preserve">Tus comentarios: </w:t>
+      </w:r>
+      <w:r>
+        <w:rPr>
+          <w:rFonts w:eastAsia="Arial"/>
+          <w:bCs/>
+        </w:rPr>
+        <w:t>se muestran las reseñas ya escritas y aparece la opción de añadir una a los platos ya consumidos.</w:t>
+      </w:r>
+      <w:r>
+        <w:t xml:space="preserve"> </w:t>
+      </w:r>
+    </w:p>
+    <w:p>
+      <w:pPr>
+        <w:pStyle w:val="normal0"/>
+        <w:numPr>
+          <w:ilvl w:val="0"/>
+          <w:numId w:val="15"/>
+        </w:numPr>
+        <w:spacing w:after="0" w:line="276" w:lineRule="auto"/>
+        <w:jc w:val="both"/>
+      </w:pPr>
+      <w:r>
+        <w:rPr>
+          <w:rFonts w:eastAsia="Arial"/>
+          <w:b/>
+          <w:bCs/>
+        </w:rPr>
+        <w:t>Realizar pedido</w:t>
+      </w:r>
+      <w:r>
+        <w:rPr>
+          <w:rFonts w:eastAsia="Arial"/>
+          <w:b/>
+          <w:bCs/>
+        </w:rPr>
         <w:t>:</w:t>
       </w:r>
       <w:r>
         <w:rPr>
           <w:rFonts w:eastAsia="Arial"/>
         </w:rPr>
-        <w:t xml:space="preserve"> registro de reservas, pedidos y </w:t>
+        <w:t xml:space="preserve"> i</w:t>
       </w:r>
       <w:r>
         <w:rPr>
           <w:rFonts w:eastAsia="Arial"/>
         </w:rPr>
-        <w:t>ofertas del marketplace canjeadas</w:t>
+        <w:t>nterfaz de carrito de compra para seleccionar platos</w:t>
       </w:r>
       <w:r>
         <w:rPr>
           <w:rFonts w:eastAsia="Arial"/>
+        </w:rPr>
+        <w:t xml:space="preserve"> a consumir</w:t>
+      </w:r>
+      <w:r>
+        <w:rPr>
+          <w:rFonts w:eastAsia="Arial"/>
+        </w:rPr>
+        <w:t>.</w:t>
+      </w:r>
+      <w:r>
+        <w:t xml:space="preserve"> </w:t>
+      </w:r>
+    </w:p>
+    <w:p>
+      <w:pPr>
+        <w:pStyle w:val="normal0"/>
+        <w:numPr>
+          <w:ilvl w:val="0"/>
+          <w:numId w:val="15"/>
+        </w:numPr>
+        <w:spacing w:after="0" w:line="276" w:lineRule="auto"/>
+        <w:jc w:val="both"/>
+      </w:pPr>
+      <w:r>
+        <w:rPr>
+          <w:rFonts w:eastAsia="Arial"/>
+          <w:b/>
+          <w:bCs/>
+        </w:rPr>
+        <w:t xml:space="preserve">Tickets: </w:t>
+      </w:r>
+      <w:r>
+        <w:rPr>
+          <w:rFonts w:eastAsia="Arial"/>
+          <w:bCs/>
+        </w:rPr>
+        <w:t>dividido en dos secciones. Por un lado, se podrá ver los tickets subidos y, por el otro, la propia opción de subida.</w:t>
+      </w:r>
+      <w:bookmarkStart w:id="7" w:name="_heading=h.tmyqkebm73v" w:colFirst="0" w:colLast="0"/>
+      <w:bookmarkStart w:id="8" w:name="_heading=h.pzi1ibaoffzv" w:colFirst="0" w:colLast="0"/>
+      <w:bookmarkEnd w:id="7"/>
+      <w:bookmarkEnd w:id="8"/>
+      <w:r>
+        <w:t xml:space="preserve"> </w:t>
+      </w:r>
+    </w:p>
+    <w:p>
+      <w:pPr>
+        <w:pStyle w:val="normal0"/>
+        <w:numPr>
+          <w:ilvl w:val="0"/>
+          <w:numId w:val="15"/>
+        </w:numPr>
+        <w:spacing w:after="0" w:line="276" w:lineRule="auto"/>
+        <w:jc w:val="both"/>
+      </w:pPr>
+      <w:r>
+        <w:rPr>
+          <w:rFonts w:eastAsia="Arial"/>
+          <w:b/>
+          <w:bCs/>
+        </w:rPr>
+        <w:t>Administración</w:t>
+      </w:r>
+      <w:r>
+        <w:rPr>
+          <w:rFonts w:eastAsia="Arial"/>
+          <w:b/>
+          <w:bCs/>
+        </w:rPr>
+        <w:t xml:space="preserve">: </w:t>
+      </w:r>
+      <w:r>
+        <w:rPr>
+          <w:rFonts w:eastAsia="Arial"/>
+          <w:bCs/>
+        </w:rPr>
+        <w:t>teniendo los permisos adecuados, se podrá gestionar las acciones del cliente y gestionar las mesas del restaurante</w:t>
+      </w:r>
+      <w:r>
+        <w:rPr>
+          <w:rFonts w:eastAsia="Arial"/>
+          <w:bCs/>
         </w:rPr>
         <w:t>.</w:t>
       </w:r>
@@ -1554,205 +1754,6 @@
         </w:rPr>
       </w:pPr>
       <w:r>
-        <w:rPr>
-          <w:rFonts w:eastAsia="Arial"/>
-          <w:b/>
-          <w:bCs/>
-        </w:rPr>
-        <w:t>Marketplace:</w:t>
-      </w:r>
-      <w:r>
-        <w:rPr>
-          <w:rFonts w:eastAsia="Arial"/>
-        </w:rPr>
-        <w:t xml:space="preserve"> t</w:t>
-      </w:r>
-      <w:r>
-        <w:rPr>
-          <w:rFonts w:eastAsia="Arial"/>
-        </w:rPr>
-        <w:t>ienda interna donde el usuario puede canjear sus puntos por benefi</w:t>
-      </w:r>
-      <w:r>
-        <w:rPr>
-          <w:rFonts w:eastAsia="Arial"/>
-        </w:rPr>
-        <w:t>cios.</w:t>
-      </w:r>
-    </w:p>
-    <w:p>
-      <w:pPr>
-        <w:pStyle w:val="normal0"/>
-        <w:numPr>
-          <w:ilvl w:val="0"/>
-          <w:numId w:val="3"/>
-        </w:numPr>
-        <w:spacing w:after="240" w:line="276" w:lineRule="auto"/>
-        <w:rPr>
-          <w:rFonts w:eastAsia="Arial"/>
-          <w:b/>
-          <w:bCs/>
-        </w:rPr>
-      </w:pPr>
-      <w:r>
-        <w:rPr>
-          <w:rFonts w:eastAsia="Arial"/>
-          <w:b/>
-          <w:bCs/>
-        </w:rPr>
-        <w:t xml:space="preserve">Tus comentarios: </w:t>
-      </w:r>
-      <w:r>
-        <w:rPr>
-          <w:rFonts w:eastAsia="Arial"/>
-          <w:bCs/>
-        </w:rPr>
-        <w:t>pantalla que muestra las ofertas canjeables por puntos. En el caso del administ</w:t>
-      </w:r>
-    </w:p>
-    <w:p>
-      <w:pPr>
-        <w:pStyle w:val="normal0"/>
-        <w:numPr>
-          <w:ilvl w:val="0"/>
-          <w:numId w:val="3"/>
-        </w:numPr>
-        <w:spacing w:after="240" w:line="276" w:lineRule="auto"/>
-        <w:rPr>
-          <w:rFonts w:eastAsia="Arial"/>
-          <w:b/>
-          <w:bCs/>
-        </w:rPr>
-      </w:pPr>
-      <w:r>
-        <w:rPr>
-          <w:rFonts w:eastAsia="Arial"/>
-          <w:b/>
-          <w:bCs/>
-        </w:rPr>
-        <w:t>Realizar pedido</w:t>
-      </w:r>
-      <w:r>
-        <w:rPr>
-          <w:rFonts w:eastAsia="Arial"/>
-          <w:b/>
-          <w:bCs/>
-        </w:rPr>
-        <w:t>:</w:t>
-      </w:r>
-      <w:r>
-        <w:rPr>
-          <w:rFonts w:eastAsia="Arial"/>
-        </w:rPr>
-        <w:t xml:space="preserve"> i</w:t>
-      </w:r>
-      <w:r>
-        <w:rPr>
-          <w:rFonts w:eastAsia="Arial"/>
-        </w:rPr>
-        <w:t>nterfaz de carrito de compra para seleccionar platos</w:t>
-      </w:r>
-      <w:r>
-        <w:rPr>
-          <w:rFonts w:eastAsia="Arial"/>
-        </w:rPr>
-        <w:t xml:space="preserve"> a consumir</w:t>
-      </w:r>
-      <w:r>
-        <w:rPr>
-          <w:rFonts w:eastAsia="Arial"/>
-        </w:rPr>
-        <w:t>.</w:t>
-      </w:r>
-    </w:p>
-    <w:p>
-      <w:pPr>
-        <w:pStyle w:val="normal0"/>
-        <w:numPr>
-          <w:ilvl w:val="0"/>
-          <w:numId w:val="3"/>
-        </w:numPr>
-        <w:spacing w:after="240" w:line="276" w:lineRule="auto"/>
-        <w:rPr>
-          <w:rFonts w:eastAsia="Arial"/>
-          <w:b/>
-          <w:bCs/>
-        </w:rPr>
-      </w:pPr>
-      <w:r>
-        <w:rPr>
-          <w:rFonts w:eastAsia="Arial"/>
-          <w:b/>
-          <w:bCs/>
-        </w:rPr>
-        <w:t xml:space="preserve">Tickets: </w:t>
-      </w:r>
-      <w:r>
-        <w:rPr>
-          <w:rFonts w:eastAsia="Arial"/>
-          <w:bCs/>
-        </w:rPr>
-        <w:t>dividido en dos secciones. Por un lado, se podrá ver los tickets subidos y, por el otro, la propia opción de subida.</w:t>
-      </w:r>
-      <w:bookmarkStart w:id="7" w:name="_heading=h.tmyqkebm73v" w:colFirst="0" w:colLast="0"/>
-      <w:bookmarkStart w:id="8" w:name="_heading=h.pzi1ibaoffzv" w:colFirst="0" w:colLast="0"/>
-      <w:bookmarkEnd w:id="7"/>
-      <w:bookmarkEnd w:id="8"/>
-    </w:p>
-    <w:p>
-      <w:pPr>
-        <w:pStyle w:val="normal0"/>
-        <w:numPr>
-          <w:ilvl w:val="0"/>
-          <w:numId w:val="3"/>
-        </w:numPr>
-        <w:spacing w:after="240" w:line="276" w:lineRule="auto"/>
-        <w:rPr>
-          <w:rFonts w:eastAsia="Arial"/>
-          <w:b/>
-          <w:bCs/>
-        </w:rPr>
-      </w:pPr>
-      <w:r>
-        <w:rPr>
-          <w:rFonts w:eastAsia="Arial"/>
-          <w:b/>
-          <w:bCs/>
-        </w:rPr>
-        <w:t>Administración</w:t>
-      </w:r>
-      <w:r>
-        <w:rPr>
-          <w:rFonts w:eastAsia="Arial"/>
-          <w:b/>
-          <w:bCs/>
-        </w:rPr>
-        <w:t xml:space="preserve">: </w:t>
-      </w:r>
-      <w:r>
-        <w:rPr>
-          <w:rFonts w:eastAsia="Arial"/>
-          <w:bCs/>
-        </w:rPr>
-        <w:t>teniendo los permisos adecuados, se podrá gestionar las acciones del cliente y gestionar las mesas del restaurante</w:t>
-      </w:r>
-    </w:p>
-    <w:p>
-      <w:pPr>
-        <w:pStyle w:val="normal0"/>
-        <w:numPr>
-          <w:ilvl w:val="0"/>
-          <w:numId w:val="3"/>
-        </w:numPr>
-        <w:spacing w:after="240" w:line="276" w:lineRule="auto"/>
-        <w:rPr>
-          <w:rFonts w:eastAsia="Arial"/>
-          <w:b/>
-          <w:bCs/>
-        </w:rPr>
-      </w:pPr>
-      <w:r>
-        <w:lastRenderedPageBreak/>
         <w:br w:type="page"/>
       </w:r>
     </w:p>
@@ -1815,7 +1816,51 @@
         <w:tc>
           <w:tcPr>
             <w:tcW w:w="2126" w:type="dxa"/>
-            <w:shd w:val="clear" w:color="auto" w:fill="EFEFEF"/>
+            <w:shd w:val="clear" w:color="auto" w:fill="D9D9D9" w:themeFill="background1" w:themeFillShade="D9"/>
+            <w:tcMar>
+              <w:top w:w="100" w:type="dxa"/>
+              <w:left w:w="100" w:type="dxa"/>
+              <w:bottom w:w="100" w:type="dxa"/>
+              <w:right w:w="100" w:type="dxa"/>
+            </w:tcMar>
+          </w:tcPr>
+          <w:p>
+            <w:pPr>
+              <w:pStyle w:val="normal0"/>
+              <w:widowControl w:val="0"/>
+              <w:pBdr>
+                <w:top w:val="nil"/>
+                <w:left w:val="nil"/>
+                <w:bottom w:val="nil"/>
+                <w:right w:val="nil"/>
+                <w:between w:val="nil"/>
+              </w:pBdr>
+              <w:tabs>
+                <w:tab w:val="right" w:pos="1926"/>
+              </w:tabs>
+              <w:spacing w:after="0" w:line="240" w:lineRule="auto"/>
+              <w:rPr>
+                <w:rFonts w:eastAsia="Arial"/>
+              </w:rPr>
+            </w:pPr>
+            <w:r>
+              <w:rPr>
+                <w:rFonts w:eastAsia="Arial"/>
+              </w:rPr>
+              <w:t>Debilidades</w:t>
+            </w:r>
+            <w:r>
+              <w:rPr>
+                <w:rFonts w:eastAsia="Arial"/>
+              </w:rPr>
+              <w:tab/>
+            </w:r>
+          </w:p>
+        </w:tc>
+        <w:tc>
+          <w:tcPr>
+            <w:tcW w:w="2126" w:type="dxa"/>
+            <w:shd w:val="clear" w:color="auto" w:fill="D9D9D9" w:themeFill="background1" w:themeFillShade="D9"/>
             <w:tcMar>
               <w:top w:w="100" w:type="dxa"/>
               <w:left w:w="100" w:type="dxa"/>
@@ -1843,14 +1888,14 @@
               <w:rPr>
                 <w:rFonts w:eastAsia="Arial"/>
               </w:rPr>
-              <w:t>Debilidades</w:t>
+              <w:t>Amenazas</w:t>
             </w:r>
           </w:p>
         </w:tc>
         <w:tc>
           <w:tcPr>
             <w:tcW w:w="2126" w:type="dxa"/>
-            <w:shd w:val="clear" w:color="auto" w:fill="EFEFEF"/>
+            <w:shd w:val="clear" w:color="auto" w:fill="D9D9D9" w:themeFill="background1" w:themeFillShade="D9"/>
             <w:tcMar>
               <w:top w:w="100" w:type="dxa"/>
               <w:left w:w="100" w:type="dxa"/>
@@ -1878,49 +1923,14 @@
               <w:rPr>
                 <w:rFonts w:eastAsia="Arial"/>
               </w:rPr>
-              <w:t>Amenazas</w:t>
+              <w:t>Fortalezas</w:t>
             </w:r>
           </w:p>
         </w:tc>
         <w:tc>
           <w:tcPr>
             <w:tcW w:w="2126" w:type="dxa"/>
-            <w:shd w:val="clear" w:color="auto" w:fill="EFEFEF"/>
-            <w:tcMar>
-              <w:top w:w="100" w:type="dxa"/>
-              <w:left w:w="100" w:type="dxa"/>
-              <w:bottom w:w="100" w:type="dxa"/>
-              <w:right w:w="100" w:type="dxa"/>
-            </w:tcMar>
-          </w:tcPr>
-          <w:p>
-            <w:pPr>
-              <w:pStyle w:val="normal0"/>
-              <w:widowControl w:val="0"/>
-              <w:pBdr>
-                <w:top w:val="nil"/>
-                <w:left w:val="nil"/>
-                <w:bottom w:val="nil"/>
-                <w:right w:val="nil"/>
-                <w:between w:val="nil"/>
-              </w:pBdr>
-              <w:spacing w:after="0" w:line="240" w:lineRule="auto"/>
-              <w:rPr>
-                <w:rFonts w:eastAsia="Arial"/>
-              </w:rPr>
-            </w:pPr>
-            <w:r>
-              <w:rPr>
-                <w:rFonts w:eastAsia="Arial"/>
-              </w:rPr>
-              <w:t>Fortalezas</w:t>
-            </w:r>
-          </w:p>
-        </w:tc>
-        <w:tc>
-          <w:tcPr>
-            <w:tcW w:w="2126" w:type="dxa"/>
-            <w:shd w:val="clear" w:color="auto" w:fill="EFEFEF"/>
+            <w:shd w:val="clear" w:color="auto" w:fill="D9D9D9" w:themeFill="background1" w:themeFillShade="D9"/>
             <w:tcMar>
               <w:top w:w="100" w:type="dxa"/>
               <w:left w:w="100" w:type="dxa"/>
@@ -2678,7 +2688,7 @@
         <w:tc>
           <w:tcPr>
             <w:tcW w:w="2220" w:type="dxa"/>
-            <w:shd w:val="clear" w:color="auto" w:fill="EFEFEF"/>
+            <w:shd w:val="clear" w:color="auto" w:fill="D9D9D9" w:themeFill="background1" w:themeFillShade="D9"/>
             <w:tcMar>
               <w:top w:w="100" w:type="dxa"/>
               <w:left w:w="100" w:type="dxa"/>
@@ -2714,7 +2724,7 @@
         <w:tc>
           <w:tcPr>
             <w:tcW w:w="2010" w:type="dxa"/>
-            <w:shd w:val="clear" w:color="auto" w:fill="EFEFEF"/>
+            <w:shd w:val="clear" w:color="auto" w:fill="D9D9D9" w:themeFill="background1" w:themeFillShade="D9"/>
             <w:tcMar>
               <w:top w:w="100" w:type="dxa"/>
               <w:left w:w="100" w:type="dxa"/>
@@ -2749,7 +2759,7 @@
         <w:tc>
           <w:tcPr>
             <w:tcW w:w="1845" w:type="dxa"/>
-            <w:shd w:val="clear" w:color="auto" w:fill="EFEFEF"/>
+            <w:shd w:val="clear" w:color="auto" w:fill="D9D9D9" w:themeFill="background1" w:themeFillShade="D9"/>
             <w:tcMar>
               <w:top w:w="100" w:type="dxa"/>
               <w:left w:w="100" w:type="dxa"/>
@@ -2784,7 +2794,7 @@
         <w:tc>
           <w:tcPr>
             <w:tcW w:w="2385" w:type="dxa"/>
-            <w:shd w:val="clear" w:color="auto" w:fill="EFEFEF"/>
+            <w:shd w:val="clear" w:color="auto" w:fill="D9D9D9" w:themeFill="background1" w:themeFillShade="D9"/>
             <w:tcMar>
               <w:top w:w="100" w:type="dxa"/>
               <w:left w:w="100" w:type="dxa"/>
@@ -4021,8 +4031,8 @@
     <w:tbl>
       <w:tblPr>
         <w:tblStyle w:val="3"/>
-        <w:tblW w:w="8504" w:type="dxa"/>
-        <w:tblInd w:w="0" w:type="dxa"/>
+        <w:tblW w:w="5667" w:type="pct"/>
+        <w:tblInd w:w="-609" w:type="dxa"/>
         <w:tblBorders>
           <w:top w:val="single" w:sz="8" w:space="0" w:color="000000"/>
           <w:left w:val="single" w:sz="8" w:space="0" w:color="000000"/>
@@ -4031,24 +4041,23 @@
           <w:insideH w:val="single" w:sz="8" w:space="0" w:color="000000"/>
           <w:insideV w:val="single" w:sz="8" w:space="0" w:color="000000"/>
         </w:tblBorders>
-        <w:tblLayout w:type="fixed"/>
         <w:tblLook w:val="0600"/>
       </w:tblPr>
       <w:tblGrid>
-        <w:gridCol w:w="2834"/>
-        <w:gridCol w:w="2835"/>
-        <w:gridCol w:w="2835"/>
+        <w:gridCol w:w="2362"/>
+        <w:gridCol w:w="1391"/>
+        <w:gridCol w:w="6112"/>
       </w:tblGrid>
       <w:tr>
         <w:trPr>
           <w:cantSplit/>
-          <w:trHeight w:val="463"/>
+          <w:trHeight w:val="1004"/>
           <w:tblHeader/>
         </w:trPr>
         <w:tc>
           <w:tcPr>
-            <w:tcW w:w="2834" w:type="dxa"/>
-            <w:shd w:val="clear" w:color="auto" w:fill="auto"/>
+            <w:tcW w:w="1197" w:type="pct"/>
+            <w:shd w:val="clear" w:color="auto" w:fill="D9D9D9" w:themeFill="background1" w:themeFillShade="D9"/>
             <w:tcMar>
               <w:top w:w="100" w:type="dxa"/>
               <w:left w:w="100" w:type="dxa"/>
@@ -4082,8 +4091,8 @@
         </w:tc>
         <w:tc>
           <w:tcPr>
-            <w:tcW w:w="2834" w:type="dxa"/>
-            <w:shd w:val="clear" w:color="auto" w:fill="auto"/>
+            <w:tcW w:w="705" w:type="pct"/>
+            <w:shd w:val="clear" w:color="auto" w:fill="D9D9D9" w:themeFill="background1" w:themeFillShade="D9"/>
             <w:tcMar>
               <w:top w:w="100" w:type="dxa"/>
               <w:left w:w="100" w:type="dxa"/>
@@ -4117,8 +4126,8 @@
         </w:tc>
         <w:tc>
           <w:tcPr>
-            <w:tcW w:w="2834" w:type="dxa"/>
-            <w:shd w:val="clear" w:color="auto" w:fill="auto"/>
+            <w:tcW w:w="3098" w:type="pct"/>
+            <w:shd w:val="clear" w:color="auto" w:fill="D9D9D9" w:themeFill="background1" w:themeFillShade="D9"/>
             <w:tcMar>
               <w:top w:w="100" w:type="dxa"/>
               <w:left w:w="100" w:type="dxa"/>
@@ -4154,12 +4163,12 @@
       <w:tr>
         <w:trPr>
           <w:cantSplit/>
-          <w:trHeight w:val="463"/>
+          <w:trHeight w:val="1004"/>
           <w:tblHeader/>
         </w:trPr>
         <w:tc>
           <w:tcPr>
-            <w:tcW w:w="2834" w:type="dxa"/>
+            <w:tcW w:w="1197" w:type="pct"/>
             <w:shd w:val="clear" w:color="auto" w:fill="auto"/>
             <w:tcMar>
               <w:top w:w="100" w:type="dxa"/>
@@ -4188,7 +4197,7 @@
               <w:rPr>
                 <w:rFonts w:eastAsia="Arial"/>
               </w:rPr>
-              <w:t>Vue</w:t>
+              <w:t>Node</w:t>
             </w:r>
             <w:r>
               <w:rPr>
@@ -4200,7 +4209,7 @@
         </w:tc>
         <w:tc>
           <w:tcPr>
-            <w:tcW w:w="2834" w:type="dxa"/>
+            <w:tcW w:w="705" w:type="pct"/>
             <w:shd w:val="clear" w:color="auto" w:fill="auto"/>
             <w:tcMar>
               <w:top w:w="100" w:type="dxa"/>
@@ -4229,14 +4238,13 @@
               <w:rPr>
                 <w:rFonts w:eastAsia="Arial"/>
               </w:rPr>
-              <w:t>Frontend</w:t>
-            </w:r>
-          </w:p>
-        </w:tc>
-        <w:tc>
-          <w:tcPr>
-            <w:tcW w:w="2834" w:type="dxa"/>
-            <w:vMerge w:val="restart"/>
+              <w:t>Backend</w:t>
+            </w:r>
+          </w:p>
+        </w:tc>
+        <w:tc>
+          <w:tcPr>
+            <w:tcW w:w="3098" w:type="pct"/>
             <w:shd w:val="clear" w:color="auto" w:fill="auto"/>
             <w:tcMar>
               <w:top w:w="100" w:type="dxa"/>
@@ -4265,7 +4273,7 @@
               <w:rPr>
                 <w:rFonts w:eastAsia="Arial"/>
               </w:rPr>
-              <w:t>Manejo del frontend</w:t>
+              <w:t>Entorno de ejecución del servidor.</w:t>
             </w:r>
           </w:p>
         </w:tc>
@@ -4273,12 +4281,12 @@
       <w:tr>
         <w:trPr>
           <w:cantSplit/>
-          <w:trHeight w:val="463"/>
+          <w:trHeight w:val="1004"/>
           <w:tblHeader/>
         </w:trPr>
         <w:tc>
           <w:tcPr>
-            <w:tcW w:w="2834" w:type="dxa"/>
+            <w:tcW w:w="1197" w:type="pct"/>
             <w:shd w:val="clear" w:color="auto" w:fill="auto"/>
             <w:tcMar>
               <w:top w:w="100" w:type="dxa"/>
@@ -4307,13 +4315,13 @@
               <w:rPr>
                 <w:rFonts w:eastAsia="Arial"/>
               </w:rPr>
-              <w:t>Vite.js</w:t>
-            </w:r>
-          </w:p>
-        </w:tc>
-        <w:tc>
-          <w:tcPr>
-            <w:tcW w:w="2834" w:type="dxa"/>
+              <w:t>Express 5</w:t>
+            </w:r>
+          </w:p>
+        </w:tc>
+        <w:tc>
+          <w:tcPr>
+            <w:tcW w:w="705" w:type="pct"/>
             <w:shd w:val="clear" w:color="auto" w:fill="auto"/>
             <w:tcMar>
               <w:top w:w="100" w:type="dxa"/>
@@ -4342,14 +4350,13 @@
               <w:rPr>
                 <w:rFonts w:eastAsia="Arial"/>
               </w:rPr>
-              <w:t>Frontend</w:t>
-            </w:r>
-          </w:p>
-        </w:tc>
-        <w:tc>
-          <w:tcPr>
-            <w:tcW w:w="2834" w:type="dxa"/>
-            <w:vMerge/>
+              <w:t>Backend</w:t>
+            </w:r>
+          </w:p>
+        </w:tc>
+        <w:tc>
+          <w:tcPr>
+            <w:tcW w:w="3098" w:type="pct"/>
             <w:shd w:val="clear" w:color="auto" w:fill="auto"/>
             <w:tcMar>
               <w:top w:w="100" w:type="dxa"/>
@@ -4374,18 +4381,24 @@
                 <w:rFonts w:eastAsia="Arial"/>
               </w:rPr>
             </w:pPr>
+            <w:r>
+              <w:rPr>
+                <w:rFonts w:eastAsia="Arial"/>
+              </w:rPr>
+              <w:t>Framework para la API REST.</w:t>
+            </w:r>
           </w:p>
         </w:tc>
       </w:tr>
       <w:tr>
         <w:trPr>
           <w:cantSplit/>
-          <w:trHeight w:val="463"/>
+          <w:trHeight w:val="1004"/>
           <w:tblHeader/>
         </w:trPr>
         <w:tc>
           <w:tcPr>
-            <w:tcW w:w="2834" w:type="dxa"/>
+            <w:tcW w:w="1197" w:type="pct"/>
             <w:shd w:val="clear" w:color="auto" w:fill="auto"/>
             <w:tcMar>
               <w:top w:w="100" w:type="dxa"/>
@@ -4414,13 +4427,13 @@
               <w:rPr>
                 <w:rFonts w:eastAsia="Arial"/>
               </w:rPr>
-              <w:t>Express.js</w:t>
-            </w:r>
-          </w:p>
-        </w:tc>
-        <w:tc>
-          <w:tcPr>
-            <w:tcW w:w="2834" w:type="dxa"/>
+              <w:t>SQLite</w:t>
+            </w:r>
+          </w:p>
+        </w:tc>
+        <w:tc>
+          <w:tcPr>
+            <w:tcW w:w="705" w:type="pct"/>
             <w:shd w:val="clear" w:color="auto" w:fill="auto"/>
             <w:tcMar>
               <w:top w:w="100" w:type="dxa"/>
@@ -4455,7 +4468,7 @@
         </w:tc>
         <w:tc>
           <w:tcPr>
-            <w:tcW w:w="2834" w:type="dxa"/>
+            <w:tcW w:w="3098" w:type="pct"/>
             <w:shd w:val="clear" w:color="auto" w:fill="auto"/>
             <w:tcMar>
               <w:top w:w="100" w:type="dxa"/>
@@ -4484,7 +4497,7 @@
               <w:rPr>
                 <w:rFonts w:eastAsia="Arial"/>
               </w:rPr>
-              <w:t>Manejo del backend</w:t>
+              <w:t>Base de datos relacional ligera.</w:t>
             </w:r>
           </w:p>
         </w:tc>
@@ -4492,12 +4505,12 @@
       <w:tr>
         <w:trPr>
           <w:cantSplit/>
-          <w:trHeight w:val="463"/>
+          <w:trHeight w:val="1004"/>
           <w:tblHeader/>
         </w:trPr>
         <w:tc>
           <w:tcPr>
-            <w:tcW w:w="2834" w:type="dxa"/>
+            <w:tcW w:w="1197" w:type="pct"/>
             <w:shd w:val="clear" w:color="auto" w:fill="auto"/>
             <w:tcMar>
               <w:top w:w="100" w:type="dxa"/>
@@ -4526,13 +4539,13 @@
               <w:rPr>
                 <w:rFonts w:eastAsia="Arial"/>
               </w:rPr>
-              <w:t>Socket.io</w:t>
-            </w:r>
-          </w:p>
-        </w:tc>
-        <w:tc>
-          <w:tcPr>
-            <w:tcW w:w="2834" w:type="dxa"/>
+              <w:t>JWT (JSON Web Tokens)</w:t>
+            </w:r>
+          </w:p>
+        </w:tc>
+        <w:tc>
+          <w:tcPr>
+            <w:tcW w:w="705" w:type="pct"/>
             <w:shd w:val="clear" w:color="auto" w:fill="auto"/>
             <w:tcMar>
               <w:top w:w="100" w:type="dxa"/>
@@ -4561,13 +4574,13 @@
               <w:rPr>
                 <w:rFonts w:eastAsia="Arial"/>
               </w:rPr>
-              <w:t>Frontend / Backend</w:t>
-            </w:r>
-          </w:p>
-        </w:tc>
-        <w:tc>
-          <w:tcPr>
-            <w:tcW w:w="2834" w:type="dxa"/>
+              <w:t>Backend</w:t>
+            </w:r>
+          </w:p>
+        </w:tc>
+        <w:tc>
+          <w:tcPr>
+            <w:tcW w:w="3098" w:type="pct"/>
             <w:shd w:val="clear" w:color="auto" w:fill="auto"/>
             <w:tcMar>
               <w:top w:w="100" w:type="dxa"/>
@@ -4596,7 +4609,7 @@
               <w:rPr>
                 <w:rFonts w:eastAsia="Arial"/>
               </w:rPr>
-              <w:t>Manejo de la comunicación cliente-servidor</w:t>
+              <w:t>Sistema de autenticación.</w:t>
             </w:r>
           </w:p>
         </w:tc>
@@ -4604,40 +4617,12 @@
       <w:tr>
         <w:trPr>
           <w:cantSplit/>
-          <w:trHeight w:val="463"/>
+          <w:trHeight w:val="1004"/>
           <w:tblHeader/>
         </w:trPr>
         <w:tc>
           <w:tcPr>
-            <w:tcW w:w="2834" w:type="dxa"/>
-            <w:shd w:val="clear" w:color="auto" w:fill="auto"/>
-            <w:tcMar>
-              <w:top w:w="100" w:type="dxa"/>
-              <w:left w:w="100" w:type="dxa"/>
-              <w:bottom w:w="100" w:type="dxa"/>
-              <w:right w:w="100" w:type="dxa"/>
-            </w:tcMar>
-          </w:tcPr>
-          <w:p>
-            <w:pPr>
-              <w:pStyle w:val="normal0"/>
-              <w:widowControl w:val="0"/>
-              <w:spacing w:after="0" w:line="240" w:lineRule="auto"/>
-              <w:rPr>
-                <w:rFonts w:eastAsia="Arial"/>
-              </w:rPr>
-            </w:pPr>
-            <w:r>
-              <w:rPr>
-                <w:rFonts w:eastAsia="Arial"/>
-              </w:rPr>
-              <w:t>dotenv</w:t>
-            </w:r>
-          </w:p>
-        </w:tc>
-        <w:tc>
-          <w:tcPr>
-            <w:tcW w:w="2834" w:type="dxa"/>
+            <w:tcW w:w="1197" w:type="pct"/>
             <w:shd w:val="clear" w:color="auto" w:fill="auto"/>
             <w:tcMar>
               <w:top w:w="100" w:type="dxa"/>
@@ -4666,13 +4651,13 @@
               <w:rPr>
                 <w:rFonts w:eastAsia="Arial"/>
               </w:rPr>
-              <w:t>Backend</w:t>
-            </w:r>
-          </w:p>
-        </w:tc>
-        <w:tc>
-          <w:tcPr>
-            <w:tcW w:w="2834" w:type="dxa"/>
+              <w:t>BCrypt</w:t>
+            </w:r>
+          </w:p>
+        </w:tc>
+        <w:tc>
+          <w:tcPr>
+            <w:tcW w:w="705" w:type="pct"/>
             <w:shd w:val="clear" w:color="auto" w:fill="auto"/>
             <w:tcMar>
               <w:top w:w="100" w:type="dxa"/>
@@ -4701,48 +4686,13 @@
               <w:rPr>
                 <w:rFonts w:eastAsia="Arial"/>
               </w:rPr>
-              <w:t>Poder manejar datos con archivos .env para mayor seguridad</w:t>
-            </w:r>
-          </w:p>
-        </w:tc>
-      </w:tr>
-      <w:tr>
-        <w:trPr>
-          <w:cantSplit/>
-          <w:trHeight w:val="463"/>
-          <w:tblHeader/>
-        </w:trPr>
-        <w:tc>
-          <w:tcPr>
-            <w:tcW w:w="2834" w:type="dxa"/>
-            <w:shd w:val="clear" w:color="auto" w:fill="auto"/>
-            <w:tcMar>
-              <w:top w:w="100" w:type="dxa"/>
-              <w:left w:w="100" w:type="dxa"/>
-              <w:bottom w:w="100" w:type="dxa"/>
-              <w:right w:w="100" w:type="dxa"/>
-            </w:tcMar>
-          </w:tcPr>
-          <w:p>
-            <w:pPr>
-              <w:pStyle w:val="normal0"/>
-              <w:widowControl w:val="0"/>
-              <w:spacing w:after="0" w:line="240" w:lineRule="auto"/>
-              <w:rPr>
-                <w:rFonts w:eastAsia="Arial"/>
-              </w:rPr>
-            </w:pPr>
-            <w:r>
-              <w:rPr>
-                <w:rFonts w:eastAsia="Arial"/>
-              </w:rPr>
-              <w:t>jsonwebtoken</w:t>
-            </w:r>
-          </w:p>
-        </w:tc>
-        <w:tc>
-          <w:tcPr>
-            <w:tcW w:w="2834" w:type="dxa"/>
+              <w:t>Backend</w:t>
+            </w:r>
+          </w:p>
+        </w:tc>
+        <w:tc>
+          <w:tcPr>
+            <w:tcW w:w="3098" w:type="pct"/>
             <w:shd w:val="clear" w:color="auto" w:fill="auto"/>
             <w:tcMar>
               <w:top w:w="100" w:type="dxa"/>
@@ -4771,13 +4721,20 @@
               <w:rPr>
                 <w:rFonts w:eastAsia="Arial"/>
               </w:rPr>
-              <w:t>Backend</w:t>
-            </w:r>
-          </w:p>
-        </w:tc>
-        <w:tc>
-          <w:tcPr>
-            <w:tcW w:w="2834" w:type="dxa"/>
+              <w:t>Cifrado de contraseñas.</w:t>
+            </w:r>
+          </w:p>
+        </w:tc>
+      </w:tr>
+      <w:tr>
+        <w:trPr>
+          <w:cantSplit/>
+          <w:trHeight w:val="1004"/>
+          <w:tblHeader/>
+        </w:trPr>
+        <w:tc>
+          <w:tcPr>
+            <w:tcW w:w="1197" w:type="pct"/>
             <w:shd w:val="clear" w:color="auto" w:fill="auto"/>
             <w:tcMar>
               <w:top w:w="100" w:type="dxa"/>
@@ -4806,48 +4763,13 @@
               <w:rPr>
                 <w:rFonts w:eastAsia="Arial"/>
               </w:rPr>
-              <w:t>Se encarga del encriptado de la información</w:t>
-            </w:r>
-          </w:p>
-        </w:tc>
-      </w:tr>
-      <w:tr>
-        <w:trPr>
-          <w:cantSplit/>
-          <w:trHeight w:val="463"/>
-          <w:tblHeader/>
-        </w:trPr>
-        <w:tc>
-          <w:tcPr>
-            <w:tcW w:w="2834" w:type="dxa"/>
-            <w:shd w:val="clear" w:color="auto" w:fill="auto"/>
-            <w:tcMar>
-              <w:top w:w="100" w:type="dxa"/>
-              <w:left w:w="100" w:type="dxa"/>
-              <w:bottom w:w="100" w:type="dxa"/>
-              <w:right w:w="100" w:type="dxa"/>
-            </w:tcMar>
-          </w:tcPr>
-          <w:p>
-            <w:pPr>
-              <w:pStyle w:val="normal0"/>
-              <w:widowControl w:val="0"/>
-              <w:spacing w:after="0" w:line="240" w:lineRule="auto"/>
-              <w:rPr>
-                <w:rFonts w:eastAsia="Arial"/>
-              </w:rPr>
-            </w:pPr>
-            <w:r>
-              <w:rPr>
-                <w:rFonts w:eastAsia="Arial"/>
-              </w:rPr>
-              <w:t>sqlite3</w:t>
-            </w:r>
-          </w:p>
-        </w:tc>
-        <w:tc>
-          <w:tcPr>
-            <w:tcW w:w="2834" w:type="dxa"/>
+              <w:t>Vue 3</w:t>
+            </w:r>
+          </w:p>
+        </w:tc>
+        <w:tc>
+          <w:tcPr>
+            <w:tcW w:w="705" w:type="pct"/>
             <w:shd w:val="clear" w:color="auto" w:fill="auto"/>
             <w:tcMar>
               <w:top w:w="100" w:type="dxa"/>
@@ -4876,13 +4798,13 @@
               <w:rPr>
                 <w:rFonts w:eastAsia="Arial"/>
               </w:rPr>
-              <w:t>Backend / BBDD</w:t>
-            </w:r>
-          </w:p>
-        </w:tc>
-        <w:tc>
-          <w:tcPr>
-            <w:tcW w:w="2834" w:type="dxa"/>
+              <w:t>Frontend</w:t>
+            </w:r>
+          </w:p>
+        </w:tc>
+        <w:tc>
+          <w:tcPr>
+            <w:tcW w:w="3098" w:type="pct"/>
             <w:shd w:val="clear" w:color="auto" w:fill="auto"/>
             <w:tcMar>
               <w:top w:w="100" w:type="dxa"/>
@@ -4908,10 +4830,7 @@
               </w:rPr>
             </w:pPr>
             <w:r>
-              <w:rPr>
-                <w:rFonts w:eastAsia="Arial"/>
-              </w:rPr>
-              <w:t>Tener una base de datos fácil de implementar por todos, cuando la aplicación esté completa se valorará pasar a una BBDD más robusta como MySQL</w:t>
+              <w:t>Framework JavaScript para el frontend (SPA)</w:t>
             </w:r>
           </w:p>
         </w:tc>
@@ -4919,40 +4838,12 @@
       <w:tr>
         <w:trPr>
           <w:cantSplit/>
-          <w:trHeight w:val="463"/>
+          <w:trHeight w:val="1004"/>
           <w:tblHeader/>
         </w:trPr>
         <w:tc>
           <w:tcPr>
-            <w:tcW w:w="2834" w:type="dxa"/>
-            <w:shd w:val="clear" w:color="auto" w:fill="auto"/>
-            <w:tcMar>
-              <w:top w:w="100" w:type="dxa"/>
-              <w:left w:w="100" w:type="dxa"/>
-              <w:bottom w:w="100" w:type="dxa"/>
-              <w:right w:w="100" w:type="dxa"/>
-            </w:tcMar>
-          </w:tcPr>
-          <w:p>
-            <w:pPr>
-              <w:pStyle w:val="normal0"/>
-              <w:widowControl w:val="0"/>
-              <w:spacing w:after="0" w:line="240" w:lineRule="auto"/>
-              <w:rPr>
-                <w:rFonts w:eastAsia="Arial"/>
-              </w:rPr>
-            </w:pPr>
-            <w:r>
-              <w:rPr>
-                <w:rFonts w:eastAsia="Arial"/>
-              </w:rPr>
-              <w:t>Ant Design (ANTD)</w:t>
-            </w:r>
-          </w:p>
-        </w:tc>
-        <w:tc>
-          <w:tcPr>
-            <w:tcW w:w="2834" w:type="dxa"/>
+            <w:tcW w:w="1197" w:type="pct"/>
             <w:shd w:val="clear" w:color="auto" w:fill="auto"/>
             <w:tcMar>
               <w:top w:w="100" w:type="dxa"/>
@@ -4981,13 +4872,13 @@
               <w:rPr>
                 <w:rFonts w:eastAsia="Arial"/>
               </w:rPr>
-              <w:t>Frontend</w:t>
-            </w:r>
-          </w:p>
-        </w:tc>
-        <w:tc>
-          <w:tcPr>
-            <w:tcW w:w="2834" w:type="dxa"/>
+              <w:t>Vite</w:t>
+            </w:r>
+          </w:p>
+        </w:tc>
+        <w:tc>
+          <w:tcPr>
+            <w:tcW w:w="705" w:type="pct"/>
             <w:shd w:val="clear" w:color="auto" w:fill="auto"/>
             <w:tcMar>
               <w:top w:w="100" w:type="dxa"/>
@@ -5016,48 +4907,13 @@
               <w:rPr>
                 <w:rFonts w:eastAsia="Arial"/>
               </w:rPr>
-              <w:t>Se encarga de manejar los estilos principales de CSS</w:t>
-            </w:r>
-          </w:p>
-        </w:tc>
-      </w:tr>
-      <w:tr>
-        <w:trPr>
-          <w:cantSplit/>
-          <w:trHeight w:val="463"/>
-          <w:tblHeader/>
-        </w:trPr>
-        <w:tc>
-          <w:tcPr>
-            <w:tcW w:w="2834" w:type="dxa"/>
-            <w:shd w:val="clear" w:color="auto" w:fill="auto"/>
-            <w:tcMar>
-              <w:top w:w="100" w:type="dxa"/>
-              <w:left w:w="100" w:type="dxa"/>
-              <w:bottom w:w="100" w:type="dxa"/>
-              <w:right w:w="100" w:type="dxa"/>
-            </w:tcMar>
-          </w:tcPr>
-          <w:p>
-            <w:pPr>
-              <w:pStyle w:val="normal0"/>
-              <w:widowControl w:val="0"/>
-              <w:spacing w:after="0" w:line="240" w:lineRule="auto"/>
-              <w:rPr>
-                <w:rFonts w:eastAsia="Arial"/>
-              </w:rPr>
-            </w:pPr>
-            <w:r>
-              <w:rPr>
-                <w:rFonts w:eastAsia="Arial"/>
-              </w:rPr>
-              <w:t>Tesseract.js</w:t>
-            </w:r>
-          </w:p>
-        </w:tc>
-        <w:tc>
-          <w:tcPr>
-            <w:tcW w:w="2834" w:type="dxa"/>
+              <w:t>Frontend</w:t>
+            </w:r>
+          </w:p>
+        </w:tc>
+        <w:tc>
+          <w:tcPr>
+            <w:tcW w:w="3098" w:type="pct"/>
             <w:shd w:val="clear" w:color="auto" w:fill="auto"/>
             <w:tcMar>
               <w:top w:w="100" w:type="dxa"/>
@@ -5078,141 +4934,9 @@
                 <w:between w:val="nil"/>
               </w:pBdr>
               <w:spacing w:after="0" w:line="240" w:lineRule="auto"/>
-              <w:rPr>
-                <w:rFonts w:eastAsia="Arial"/>
-              </w:rPr>
-            </w:pPr>
-            <w:r>
-              <w:rPr>
-                <w:rFonts w:eastAsia="Arial"/>
-              </w:rPr>
-              <w:t>Backend</w:t>
-            </w:r>
-          </w:p>
-        </w:tc>
-        <w:tc>
-          <w:tcPr>
-            <w:tcW w:w="2834" w:type="dxa"/>
-            <w:shd w:val="clear" w:color="auto" w:fill="auto"/>
-            <w:tcMar>
-              <w:top w:w="100" w:type="dxa"/>
-              <w:left w:w="100" w:type="dxa"/>
-              <w:bottom w:w="100" w:type="dxa"/>
-              <w:right w:w="100" w:type="dxa"/>
-            </w:tcMar>
-          </w:tcPr>
-          <w:p>
-            <w:pPr>
-              <w:pStyle w:val="normal0"/>
-              <w:widowControl w:val="0"/>
-              <w:spacing w:after="0" w:line="240" w:lineRule="auto"/>
-              <w:rPr>
-                <w:rFonts w:eastAsia="Arial"/>
-              </w:rPr>
-            </w:pPr>
-            <w:r>
-              <w:rPr>
-                <w:rFonts w:eastAsia="Arial"/>
-              </w:rPr>
-              <w:t>Es una librería de Node.js que procesa la imagen localmente. Es gratuita pero requiere que la foto sea muy nítida.</w:t>
-            </w:r>
-          </w:p>
-        </w:tc>
-      </w:tr>
-      <w:tr>
-        <w:trPr>
-          <w:cantSplit/>
-          <w:trHeight w:val="463"/>
-          <w:tblHeader/>
-        </w:trPr>
-        <w:tc>
-          <w:tcPr>
-            <w:tcW w:w="2834" w:type="dxa"/>
-            <w:shd w:val="clear" w:color="auto" w:fill="auto"/>
-            <w:tcMar>
-              <w:top w:w="100" w:type="dxa"/>
-              <w:left w:w="100" w:type="dxa"/>
-              <w:bottom w:w="100" w:type="dxa"/>
-              <w:right w:w="100" w:type="dxa"/>
-            </w:tcMar>
-          </w:tcPr>
-          <w:p>
-            <w:pPr>
-              <w:pStyle w:val="normal0"/>
-              <w:widowControl w:val="0"/>
-              <w:spacing w:after="0" w:line="240" w:lineRule="auto"/>
-              <w:rPr>
-                <w:rFonts w:eastAsia="Arial"/>
-              </w:rPr>
-            </w:pPr>
-            <w:r>
-              <w:rPr>
-                <w:rFonts w:eastAsia="Arial"/>
-              </w:rPr>
-              <w:t>Multer</w:t>
-            </w:r>
-          </w:p>
-        </w:tc>
-        <w:tc>
-          <w:tcPr>
-            <w:tcW w:w="2834" w:type="dxa"/>
-            <w:shd w:val="clear" w:color="auto" w:fill="auto"/>
-            <w:tcMar>
-              <w:top w:w="100" w:type="dxa"/>
-              <w:left w:w="100" w:type="dxa"/>
-              <w:bottom w:w="100" w:type="dxa"/>
-              <w:right w:w="100" w:type="dxa"/>
-            </w:tcMar>
-          </w:tcPr>
-          <w:p>
-            <w:pPr>
-              <w:pStyle w:val="normal0"/>
-              <w:widowControl w:val="0"/>
-              <w:pBdr>
-                <w:top w:val="nil"/>
-                <w:left w:val="nil"/>
-                <w:bottom w:val="nil"/>
-                <w:right w:val="nil"/>
-                <w:between w:val="nil"/>
-              </w:pBdr>
-              <w:spacing w:after="0" w:line="240" w:lineRule="auto"/>
-              <w:rPr>
-                <w:rFonts w:eastAsia="Arial"/>
-              </w:rPr>
-            </w:pPr>
-            <w:r>
-              <w:rPr>
-                <w:rFonts w:eastAsia="Arial"/>
-              </w:rPr>
-              <w:t xml:space="preserve">Backend </w:t>
-            </w:r>
-          </w:p>
-        </w:tc>
-        <w:tc>
-          <w:tcPr>
-            <w:tcW w:w="2834" w:type="dxa"/>
-            <w:shd w:val="clear" w:color="auto" w:fill="auto"/>
-            <w:tcMar>
-              <w:top w:w="100" w:type="dxa"/>
-              <w:left w:w="100" w:type="dxa"/>
-              <w:bottom w:w="100" w:type="dxa"/>
-              <w:right w:w="100" w:type="dxa"/>
-            </w:tcMar>
-          </w:tcPr>
-          <w:p>
-            <w:pPr>
-              <w:pStyle w:val="normal0"/>
-              <w:widowControl w:val="0"/>
-              <w:spacing w:after="0" w:line="240" w:lineRule="auto"/>
-              <w:rPr>
-                <w:rFonts w:eastAsia="Arial"/>
-              </w:rPr>
-            </w:pPr>
-            <w:r>
-              <w:rPr>
-                <w:rFonts w:eastAsia="Arial"/>
-              </w:rPr>
-              <w:t>Es una librería que actúa de middleware para subir archivos al servidor</w:t>
+            </w:pPr>
+            <w:r>
+              <w:t>Bundler y servidor de desarrollo</w:t>
             </w:r>
           </w:p>
         </w:tc>
@@ -5239,6 +4963,22 @@
         </w:rPr>
         <w:tab/>
       </w:r>
+    </w:p>
+    <w:p>
+      <w:pPr>
+        <w:pStyle w:val="normal0"/>
+        <w:rPr>
+          <w:rFonts w:ascii="Arial" w:eastAsia="Arial" w:hAnsi="Arial" w:cs="Arial"/>
+        </w:rPr>
+      </w:pPr>
+    </w:p>
+    <w:p>
+      <w:pPr>
+        <w:pStyle w:val="normal0"/>
+        <w:rPr>
+          <w:rFonts w:ascii="Arial" w:eastAsia="Arial" w:hAnsi="Arial" w:cs="Arial"/>
+        </w:rPr>
+      </w:pPr>
     </w:p>
     <w:p>
       <w:pPr>
@@ -5283,6 +5023,26 @@
         </w:rPr>
         <w:lastRenderedPageBreak/>
         <w:t>Diseño de la aplicación</w:t>
+      </w:r>
+      <w:bookmarkStart w:id="13" w:name="_heading=h.szpgyjbi3bx9" w:colFirst="0" w:colLast="0"/>
+      <w:bookmarkEnd w:id="13"/>
+    </w:p>
+    <w:p>
+      <w:pPr>
+        <w:pStyle w:val="Ttulo1"/>
+        <w:ind w:left="0" w:firstLine="0"/>
+        <w:rPr>
+          <w:rFonts w:ascii="Calibri" w:eastAsia="Arial" w:hAnsi="Calibri" w:cs="Calibri"/>
+        </w:rPr>
+      </w:pPr>
+      <w:r>
+        <w:rPr>
+          <w:rFonts w:ascii="Calibri" w:eastAsia="Arial" w:hAnsi="Calibri" w:cs="Calibri"/>
+          <w:color w:val="000000"/>
+          <w:sz w:val="26"/>
+          <w:szCs w:val="26"/>
+        </w:rPr>
+        <w:t>5.1. Casos de Uso</w:t>
       </w:r>
     </w:p>
     <w:p>
@@ -5300,8 +5060,8 @@
           <w:szCs w:val="26"/>
         </w:rPr>
       </w:pPr>
-      <w:bookmarkStart w:id="13" w:name="_heading=h.szpgyjbi3bx9" w:colFirst="0" w:colLast="0"/>
-      <w:bookmarkEnd w:id="13"/>
+      <w:bookmarkStart w:id="14" w:name="_heading=h.5p92d0d39y4u" w:colFirst="0" w:colLast="0"/>
+      <w:bookmarkEnd w:id="14"/>
       <w:r>
         <w:rPr>
           <w:noProof/>
@@ -5326,39 +5086,12 @@
             <v:path o:extrusionok="f" gradientshapeok="t" o:connecttype="rect"/>
             <o:lock v:ext="edit" aspectratio="t"/>
           </v:shapetype>
-          <v:shape id="_x0000_s1028" type="#_x0000_t75" style="position:absolute;left:0;text-align:left;margin-left:-77.1pt;margin-top:17.35pt;width:580.5pt;height:367.3pt;z-index:-251655680" wrapcoords="1069 0 687 121 343 543 496 1931 267 2172 267 2594 382 2896 1030 3861 611 3922 229 4344 267 5370 5190 5792 1183 5792 229 5853 229 7301 4847 7723 1336 7904 76 8025 76 9473 2404 9654 10800 9654 1221 10076 153 10197 114 10981 343 11464 649 11584 687 12550 343 12670 76 13093 114 13998 5763 14480 10800 14480 76 15144 -38 15747 -38 16049 229 16411 229 16773 7136 17377 10800 17377 10495 17920 10342 18282 840 18523 840 19066 10800 19307 916 20031 916 20152 1183 20152 6411 20152 10876 19790 10800 17377 11182 17377 14731 16532 14960 16230 15036 15868 14883 15446 14960 15144 13929 14903 10800 14480 10342 13817 2061 13515 4541 12912 11792 12550 21371 12067 21333 11584 21562 11343 21600 10860 21600 10136 20341 10016 10800 9654 10037 8930 9655 8869 2213 8688 11220 7723 11563 7180 11487 6758 10762 5792 2213 4827 4427 4103 1450 3861 2099 2896 4580 2112 1984 1931 14464 1508 2366 965 4770 181 1679 0 1069 0">
+          <v:shape id="_x0000_s1028" type="#_x0000_t75" style="position:absolute;left:0;text-align:left;margin-left:-78.6pt;margin-top:8.9pt;width:580.5pt;height:367.3pt;z-index:-251655680" wrapcoords="1069 0 687 121 343 543 496 1931 267 2172 267 2594 382 2896 1030 3861 611 3922 229 4344 267 5370 5190 5792 1183 5792 229 5853 229 7301 4847 7723 1336 7904 76 8025 76 9473 2404 9654 10800 9654 1221 10076 153 10197 114 10981 343 11464 649 11584 687 12550 343 12670 76 13093 114 13998 5763 14480 10800 14480 76 15144 -38 15747 -38 16049 229 16411 229 16773 7136 17377 10800 17377 10495 17920 10342 18282 840 18523 840 19066 10800 19307 916 20031 916 20152 1183 20152 6411 20152 10876 19790 10800 17377 11182 17377 14731 16532 14960 16230 15036 15868 14883 15446 14960 15144 13929 14903 10800 14480 10342 13817 2061 13515 4541 12912 11792 12550 21371 12067 21333 11584 21562 11343 21600 10860 21600 10136 20341 10016 10800 9654 10037 8930 9655 8869 2213 8688 11220 7723 11563 7180 11487 6758 10762 5792 2213 4827 4427 4103 1450 3861 2099 2896 4580 2112 1984 1931 14464 1508 2366 965 4770 181 1679 0 1069 0">
             <v:imagedata r:id="rId16" o:title="casos de uso tfg"/>
             <w10:wrap type="through"/>
           </v:shape>
         </w:pict>
       </w:r>
-      <w:r>
-        <w:rPr>
-          <w:rFonts w:ascii="Calibri" w:eastAsia="Arial" w:hAnsi="Calibri" w:cs="Calibri"/>
-          <w:color w:val="000000"/>
-          <w:sz w:val="26"/>
-          <w:szCs w:val="26"/>
-        </w:rPr>
-        <w:t>5.1. Casos de Uso</w:t>
-      </w:r>
-    </w:p>
-    <w:p>
-      <w:pPr>
-        <w:pStyle w:val="Ttulo3"/>
-        <w:keepNext w:val="0"/>
-        <w:keepLines w:val="0"/>
-        <w:spacing w:before="0" w:after="80" w:line="276" w:lineRule="auto"/>
-        <w:ind w:left="0" w:firstLine="0"/>
-        <w:jc w:val="both"/>
-        <w:rPr>
-          <w:rFonts w:ascii="Calibri" w:eastAsia="Arial" w:hAnsi="Calibri" w:cs="Calibri"/>
-          <w:color w:val="000000"/>
-          <w:sz w:val="26"/>
-          <w:szCs w:val="26"/>
-        </w:rPr>
-      </w:pPr>
-      <w:bookmarkStart w:id="14" w:name="_heading=h.5p92d0d39y4u" w:colFirst="0" w:colLast="0"/>
-      <w:bookmarkEnd w:id="14"/>
     </w:p>
     <w:p>
       <w:pPr>
@@ -14729,7 +14462,7 @@
         <w:noProof/>
         <w:color w:val="041C2C"/>
       </w:rPr>
-      <w:t>4</w:t>
+      <w:t>8</w:t>
     </w:r>
     <w:r>
       <w:rPr>
@@ -15086,17 +14819,17 @@
   <w:abstractNum w:abstractNumId="1">
     <w:nsid w:val="0EA927E7"/>
     <w:multiLevelType w:val="multilevel"/>
-    <w:tmpl w:val="F4BC7922"/>
+    <w:tmpl w:val="0CE85ADE"/>
     <w:lvl w:ilvl="0">
       <w:start w:val="1"/>
       <w:numFmt w:val="bullet"/>
-      <w:lvlText w:val="●"/>
+      <w:lvlText w:val="-"/>
       <w:lvlJc w:val="left"/>
       <w:pPr>
         <w:ind w:left="720" w:hanging="360"/>
       </w:pPr>
       <w:rPr>
-        <w:rFonts w:ascii="Arial" w:eastAsia="Arial" w:hAnsi="Arial" w:cs="Arial"/>
+        <w:rFonts w:ascii="Calibri" w:hAnsi="Calibri" w:hint="default"/>
         <w:u w:val="none"/>
       </w:rPr>
     </w:lvl>
@@ -16280,6 +16013,119 @@
     </w:lvl>
   </w:abstractNum>
   <w:abstractNum w:abstractNumId="12">
+    <w:nsid w:val="67CF3E51"/>
+    <w:multiLevelType w:val="hybridMultilevel"/>
+    <w:tmpl w:val="AE6E57E8"/>
+    <w:lvl w:ilvl="0" w:tplc="929016FC">
+      <w:start w:val="1"/>
+      <w:numFmt w:val="bullet"/>
+      <w:lvlText w:val="-"/>
+      <w:lvlJc w:val="left"/>
+      <w:pPr>
+        <w:ind w:left="720" w:hanging="360"/>
+      </w:pPr>
+      <w:rPr>
+        <w:rFonts w:ascii="Calibri" w:hAnsi="Calibri" w:hint="default"/>
+      </w:rPr>
+    </w:lvl>
+    <w:lvl w:ilvl="1" w:tplc="0C0A0003" w:tentative="1">
+      <w:start w:val="1"/>
+      <w:numFmt w:val="bullet"/>
+      <w:lvlText w:val="o"/>
+      <w:lvlJc w:val="left"/>
+      <w:pPr>
+        <w:ind w:left="1440" w:hanging="360"/>
+      </w:pPr>
+      <w:rPr>
+        <w:rFonts w:ascii="Courier New" w:hAnsi="Courier New" w:cs="Courier New" w:hint="default"/>
+      </w:rPr>
+    </w:lvl>
+    <w:lvl w:ilvl="2" w:tplc="0C0A0005" w:tentative="1">
+      <w:start w:val="1"/>
+      <w:numFmt w:val="bullet"/>
+      <w:lvlText w:val=""/>
+      <w:lvlJc w:val="left"/>
+      <w:pPr>
+        <w:ind w:left="2160" w:hanging="360"/>
+      </w:pPr>
+      <w:rPr>
+        <w:rFonts w:ascii="Wingdings" w:hAnsi="Wingdings" w:hint="default"/>
+      </w:rPr>
+    </w:lvl>
+    <w:lvl w:ilvl="3" w:tplc="0C0A0001" w:tentative="1">
+      <w:start w:val="1"/>
+      <w:numFmt w:val="bullet"/>
+      <w:lvlText w:val=""/>
+      <w:lvlJc w:val="left"/>
+      <w:pPr>
+        <w:ind w:left="2880" w:hanging="360"/>
+      </w:pPr>
+      <w:rPr>
+        <w:rFonts w:ascii="Symbol" w:hAnsi="Symbol" w:hint="default"/>
+      </w:rPr>
+    </w:lvl>
+    <w:lvl w:ilvl="4" w:tplc="0C0A0003" w:tentative="1">
+      <w:start w:val="1"/>
+      <w:numFmt w:val="bullet"/>
+      <w:lvlText w:val="o"/>
+      <w:lvlJc w:val="left"/>
+      <w:pPr>
+        <w:ind w:left="3600" w:hanging="360"/>
+      </w:pPr>
+      <w:rPr>
+        <w:rFonts w:ascii="Courier New" w:hAnsi="Courier New" w:cs="Courier New" w:hint="default"/>
+      </w:rPr>
+    </w:lvl>
+    <w:lvl w:ilvl="5" w:tplc="0C0A0005" w:tentative="1">
+      <w:start w:val="1"/>
+      <w:numFmt w:val="bullet"/>
+      <w:lvlText w:val=""/>
+      <w:lvlJc w:val="left"/>
+      <w:pPr>
+        <w:ind w:left="4320" w:hanging="360"/>
+      </w:pPr>
+      <w:rPr>
+        <w:rFonts w:ascii="Wingdings" w:hAnsi="Wingdings" w:hint="default"/>
+      </w:rPr>
+    </w:lvl>
+    <w:lvl w:ilvl="6" w:tplc="0C0A0001" w:tentative="1">
+      <w:start w:val="1"/>
+      <w:numFmt w:val="bullet"/>
+      <w:lvlText w:val=""/>
+      <w:lvlJc w:val="left"/>
+      <w:pPr>
+        <w:ind w:left="5040" w:hanging="360"/>
+      </w:pPr>
+      <w:rPr>
+        <w:rFonts w:ascii="Symbol" w:hAnsi="Symbol" w:hint="default"/>
+      </w:rPr>
+    </w:lvl>
+    <w:lvl w:ilvl="7" w:tplc="0C0A0003" w:tentative="1">
+      <w:start w:val="1"/>
+      <w:numFmt w:val="bullet"/>
+      <w:lvlText w:val="o"/>
+      <w:lvlJc w:val="left"/>
+      <w:pPr>
+        <w:ind w:left="5760" w:hanging="360"/>
+      </w:pPr>
+      <w:rPr>
+        <w:rFonts w:ascii="Courier New" w:hAnsi="Courier New" w:cs="Courier New" w:hint="default"/>
+      </w:rPr>
+    </w:lvl>
+    <w:lvl w:ilvl="8" w:tplc="0C0A0005" w:tentative="1">
+      <w:start w:val="1"/>
+      <w:numFmt w:val="bullet"/>
+      <w:lvlText w:val=""/>
+      <w:lvlJc w:val="left"/>
+      <w:pPr>
+        <w:ind w:left="6480" w:hanging="360"/>
+      </w:pPr>
+      <w:rPr>
+        <w:rFonts w:ascii="Wingdings" w:hAnsi="Wingdings" w:hint="default"/>
+      </w:rPr>
+    </w:lvl>
+  </w:abstractNum>
+  <w:abstractNum w:abstractNumId="13">
     <w:nsid w:val="693F6802"/>
     <w:multiLevelType w:val="multilevel"/>
     <w:tmpl w:val="E4F06D18"/>
@@ -16393,7 +16239,7 @@
       </w:rPr>
     </w:lvl>
   </w:abstractNum>
-  <w:abstractNum w:abstractNumId="13">
+  <w:abstractNum w:abstractNumId="14">
     <w:nsid w:val="7E8F14C9"/>
     <w:multiLevelType w:val="multilevel"/>
     <w:tmpl w:val="4DC630FC"/>
@@ -16564,7 +16410,7 @@
     <w:abstractNumId w:val="3"/>
   </w:num>
   <w:num w:numId="8">
-    <w:abstractNumId w:val="12"/>
+    <w:abstractNumId w:val="13"/>
   </w:num>
   <w:num w:numId="9">
     <w:abstractNumId w:val="11"/>
@@ -16582,7 +16428,10 @@
     <w:abstractNumId w:val="10"/>
   </w:num>
   <w:num w:numId="14">
-    <w:abstractNumId w:val="13"/>
+    <w:abstractNumId w:val="14"/>
+  </w:num>
+  <w:num w:numId="15">
+    <w:abstractNumId w:val="12"/>
   </w:num>
 </w:numbering>
 </file>
@@ -17528,6 +17377,17 @@
       <w:szCs w:val="24"/>
     </w:rPr>
   </w:style>
+  <w:style w:type="character" w:styleId="Textoennegrita">
+    <w:name w:val="Strong"/>
+    <w:basedOn w:val="Fuentedeprrafopredeter"/>
+    <w:uiPriority w:val="22"/>
+    <w:qFormat/>
+    <w:rsid w:val="00EA385D"/>
+    <w:rPr>
+      <w:b/>
+      <w:bCs/>
+    </w:rPr>
+  </w:style>
 </w:styles>
 </file>
 

</xml_diff>

<commit_message>
add(docs): arquitectura y librerías
</commit_message>
<xml_diff>
--- a/Memoria_Proyecto.docx
+++ b/Memoria_Proyecto.docx
@@ -387,6 +387,14 @@
         </w:rPr>
         <w:t>Introducción</w:t>
       </w:r>
+      <w:r>
+        <w:rPr>
+          <w:rFonts w:ascii="Arial" w:eastAsia="Arial" w:hAnsi="Arial" w:cs="Arial"/>
+          <w:sz w:val="26"/>
+          <w:szCs w:val="26"/>
+        </w:rPr>
+        <w:t xml:space="preserve"> </w:t>
+      </w:r>
     </w:p>
     <w:p>
       <w:pPr>
@@ -420,6 +428,14 @@
           <w:szCs w:val="26"/>
         </w:rPr>
         <w:t>Descripción de la aplicación</w:t>
+      </w:r>
+      <w:r>
+        <w:rPr>
+          <w:rFonts w:ascii="Arial" w:eastAsia="Arial" w:hAnsi="Arial" w:cs="Arial"/>
+          <w:sz w:val="26"/>
+          <w:szCs w:val="26"/>
+        </w:rPr>
+        <w:t xml:space="preserve">  </w:t>
       </w:r>
     </w:p>
     <w:p>
@@ -13936,45 +13952,932 @@
     </w:p>
     <w:p>
       <w:pPr>
+        <w:spacing w:line="240" w:lineRule="auto"/>
+        <w:jc w:val="both"/>
+        <w:rPr>
+          <w:rFonts w:eastAsia="Times New Roman"/>
+          <w:sz w:val="24"/>
+          <w:szCs w:val="24"/>
+        </w:rPr>
+      </w:pPr>
+      <w:r>
+        <w:rPr>
+          <w:rFonts w:eastAsia="Times New Roman"/>
+          <w:color w:val="000000"/>
+        </w:rPr>
+        <w:t>La aplicación está dividida en una arquitectura cliente-servidor, está conformado por el frontend encargado de mostrar los datos al usuario y permitir la interacción y backend encargado de la gestión de los datos.</w:t>
+      </w:r>
+    </w:p>
+    <w:p>
+      <w:pPr>
+        <w:spacing w:line="240" w:lineRule="auto"/>
+        <w:jc w:val="both"/>
+        <w:rPr>
+          <w:rFonts w:eastAsia="Times New Roman"/>
+          <w:i/>
+          <w:sz w:val="24"/>
+          <w:szCs w:val="24"/>
+        </w:rPr>
+      </w:pPr>
+      <w:r>
+        <w:rPr>
+          <w:rFonts w:eastAsia="Times New Roman"/>
+          <w:i/>
+          <w:color w:val="000000"/>
+        </w:rPr>
+        <w:t>Arquitectura del Backend</w:t>
+      </w:r>
+    </w:p>
+    <w:p>
+      <w:pPr>
+        <w:spacing w:line="240" w:lineRule="auto"/>
+        <w:jc w:val="both"/>
+        <w:rPr>
+          <w:rFonts w:eastAsia="Times New Roman"/>
+          <w:sz w:val="24"/>
+          <w:szCs w:val="24"/>
+        </w:rPr>
+      </w:pPr>
+      <w:r>
+        <w:rPr>
+          <w:rFonts w:eastAsia="Times New Roman"/>
+          <w:color w:val="000000"/>
+        </w:rPr>
+        <w:t>El sistema de almacenamiento de datos se componen por una base de datos en SQLite la cual posee una autoiniciación partiendo de un archivo seed.sql.</w:t>
+      </w:r>
+    </w:p>
+    <w:p>
+      <w:pPr>
+        <w:spacing w:line="240" w:lineRule="auto"/>
+        <w:jc w:val="both"/>
+        <w:rPr>
+          <w:rFonts w:eastAsia="Times New Roman"/>
+          <w:sz w:val="24"/>
+          <w:szCs w:val="24"/>
+        </w:rPr>
+      </w:pPr>
+      <w:r>
+        <w:rPr>
+          <w:rFonts w:eastAsia="Times New Roman"/>
+          <w:color w:val="000000"/>
+        </w:rPr>
+        <w:t>La arquitectura del Backend se conforma por una arquitectura en capas, esta se compone por:</w:t>
+      </w:r>
+    </w:p>
+    <w:p>
+      <w:pPr>
+        <w:numPr>
+          <w:ilvl w:val="0"/>
+          <w:numId w:val="22"/>
+        </w:numPr>
+        <w:spacing w:after="0" w:line="240" w:lineRule="auto"/>
+        <w:jc w:val="both"/>
+        <w:textAlignment w:val="baseline"/>
+        <w:rPr>
+          <w:rFonts w:eastAsia="Times New Roman"/>
+          <w:color w:val="000000"/>
+        </w:rPr>
+      </w:pPr>
+      <w:r>
+        <w:rPr>
+          <w:rFonts w:eastAsia="Times New Roman"/>
+          <w:color w:val="000000"/>
+        </w:rPr>
+        <w:t>routes: Entrada de las peticiones del front, define los endpoints de la API.</w:t>
+      </w:r>
+    </w:p>
+    <w:p>
+      <w:pPr>
+        <w:numPr>
+          <w:ilvl w:val="0"/>
+          <w:numId w:val="22"/>
+        </w:numPr>
+        <w:spacing w:after="0" w:line="240" w:lineRule="auto"/>
+        <w:jc w:val="both"/>
+        <w:textAlignment w:val="baseline"/>
+        <w:rPr>
+          <w:rFonts w:eastAsia="Times New Roman"/>
+          <w:color w:val="000000"/>
+        </w:rPr>
+      </w:pPr>
+      <w:r>
+        <w:rPr>
+          <w:rFonts w:eastAsia="Times New Roman"/>
+          <w:color w:val="000000"/>
+        </w:rPr>
+        <w:t>controllers: Gestiona las peticiones que llegan desde el frontend a través de las rutas.</w:t>
+      </w:r>
+    </w:p>
+    <w:p>
+      <w:pPr>
+        <w:numPr>
+          <w:ilvl w:val="0"/>
+          <w:numId w:val="22"/>
+        </w:numPr>
+        <w:spacing w:after="0" w:line="240" w:lineRule="auto"/>
+        <w:jc w:val="both"/>
+        <w:textAlignment w:val="baseline"/>
+        <w:rPr>
+          <w:rFonts w:eastAsia="Times New Roman"/>
+          <w:color w:val="000000"/>
+        </w:rPr>
+      </w:pPr>
+      <w:r>
+        <w:rPr>
+          <w:rFonts w:eastAsia="Times New Roman"/>
+          <w:color w:val="000000"/>
+        </w:rPr>
+        <w:t>services: Capa intermedia entre el controller y el repository se encarga de validar los datos.</w:t>
+      </w:r>
+    </w:p>
+    <w:p>
+      <w:pPr>
+        <w:numPr>
+          <w:ilvl w:val="0"/>
+          <w:numId w:val="22"/>
+        </w:numPr>
+        <w:spacing w:after="0" w:line="240" w:lineRule="auto"/>
+        <w:jc w:val="both"/>
+        <w:textAlignment w:val="baseline"/>
+        <w:rPr>
+          <w:rFonts w:eastAsia="Times New Roman"/>
+          <w:color w:val="000000"/>
+        </w:rPr>
+      </w:pPr>
+      <w:r>
+        <w:rPr>
+          <w:rFonts w:eastAsia="Times New Roman"/>
+          <w:color w:val="000000"/>
+        </w:rPr>
+        <w:t>repository: Capa encargada de realizar las consultas a la base de datos.</w:t>
+      </w:r>
+    </w:p>
+    <w:p>
+      <w:pPr>
+        <w:numPr>
+          <w:ilvl w:val="0"/>
+          <w:numId w:val="22"/>
+        </w:numPr>
+        <w:spacing w:after="0" w:line="240" w:lineRule="auto"/>
+        <w:jc w:val="both"/>
+        <w:textAlignment w:val="baseline"/>
+        <w:rPr>
+          <w:rFonts w:eastAsia="Times New Roman"/>
+          <w:color w:val="000000"/>
+        </w:rPr>
+      </w:pPr>
+      <w:r>
+        <w:rPr>
+          <w:rFonts w:eastAsia="Times New Roman"/>
+          <w:color w:val="000000"/>
+        </w:rPr>
+        <w:t>utils: Contiene diferentes herramientas, en este caso gestión de la base de datos, la encriptación de datos sensibles, control de tokens…</w:t>
+      </w:r>
+    </w:p>
+    <w:p>
+      <w:pPr>
+        <w:numPr>
+          <w:ilvl w:val="0"/>
+          <w:numId w:val="22"/>
+        </w:numPr>
+        <w:spacing w:after="0" w:line="240" w:lineRule="auto"/>
+        <w:jc w:val="both"/>
+        <w:textAlignment w:val="baseline"/>
+        <w:rPr>
+          <w:rFonts w:eastAsia="Times New Roman"/>
+          <w:color w:val="000000"/>
+        </w:rPr>
+      </w:pPr>
+      <w:r>
+        <w:rPr>
+          <w:rFonts w:eastAsia="Times New Roman"/>
+          <w:color w:val="000000"/>
+        </w:rPr>
+        <w:t>uploads: Directorio que guarda las diferentes imágenes que se suben al back.</w:t>
+      </w:r>
+    </w:p>
+    <w:p>
+      <w:pPr>
+        <w:numPr>
+          <w:ilvl w:val="0"/>
+          <w:numId w:val="22"/>
+        </w:numPr>
+        <w:spacing w:line="240" w:lineRule="auto"/>
+        <w:jc w:val="both"/>
+        <w:textAlignment w:val="baseline"/>
+        <w:rPr>
+          <w:rFonts w:eastAsia="Times New Roman"/>
+          <w:color w:val="000000"/>
+        </w:rPr>
+      </w:pPr>
+      <w:r>
+        <w:rPr>
+          <w:rFonts w:eastAsia="Times New Roman"/>
+          <w:color w:val="000000"/>
+        </w:rPr>
+        <w:t>classes: Define los objetos.</w:t>
+      </w:r>
+    </w:p>
+    <w:p>
+      <w:pPr>
+        <w:spacing w:after="0" w:line="240" w:lineRule="auto"/>
+        <w:jc w:val="both"/>
+        <w:rPr>
+          <w:rFonts w:eastAsia="Times New Roman"/>
+          <w:sz w:val="24"/>
+          <w:szCs w:val="24"/>
+        </w:rPr>
+      </w:pPr>
+    </w:p>
+    <w:p>
+      <w:pPr>
+        <w:spacing w:line="240" w:lineRule="auto"/>
+        <w:jc w:val="both"/>
+        <w:rPr>
+          <w:rFonts w:eastAsia="Times New Roman"/>
+          <w:i/>
+          <w:sz w:val="24"/>
+          <w:szCs w:val="24"/>
+        </w:rPr>
+      </w:pPr>
+      <w:r>
+        <w:rPr>
+          <w:rFonts w:eastAsia="Times New Roman"/>
+          <w:i/>
+          <w:color w:val="000000"/>
+        </w:rPr>
+        <w:t>Arquitectura Frontend</w:t>
+      </w:r>
+    </w:p>
+    <w:p>
+      <w:pPr>
+        <w:spacing w:line="240" w:lineRule="auto"/>
+        <w:jc w:val="both"/>
+        <w:rPr>
+          <w:rFonts w:eastAsia="Times New Roman"/>
+          <w:sz w:val="24"/>
+          <w:szCs w:val="24"/>
+        </w:rPr>
+      </w:pPr>
+      <w:r>
+        <w:rPr>
+          <w:rFonts w:eastAsia="Times New Roman"/>
+          <w:color w:val="000000"/>
+        </w:rPr>
+        <w:t>La arquitectura del frontend es una arquitectura basada en componentes permitiendo una gran escalabilidad, este se organiza de esta manera:</w:t>
+      </w:r>
+    </w:p>
+    <w:p>
+      <w:pPr>
+        <w:numPr>
+          <w:ilvl w:val="0"/>
+          <w:numId w:val="23"/>
+        </w:numPr>
+        <w:spacing w:after="0" w:line="240" w:lineRule="auto"/>
+        <w:jc w:val="both"/>
+        <w:textAlignment w:val="baseline"/>
+        <w:rPr>
+          <w:rFonts w:eastAsia="Times New Roman"/>
+          <w:color w:val="000000"/>
+        </w:rPr>
+      </w:pPr>
+      <w:r>
+        <w:rPr>
+          <w:rFonts w:eastAsia="Times New Roman"/>
+          <w:color w:val="000000"/>
+        </w:rPr>
+        <w:t>components: Aporta los componentes que se utilizan a lo largo de la aplicación.</w:t>
+      </w:r>
+    </w:p>
+    <w:p>
+      <w:pPr>
+        <w:numPr>
+          <w:ilvl w:val="0"/>
+          <w:numId w:val="23"/>
+        </w:numPr>
+        <w:spacing w:after="0" w:line="240" w:lineRule="auto"/>
+        <w:jc w:val="both"/>
+        <w:textAlignment w:val="baseline"/>
+        <w:rPr>
+          <w:rFonts w:eastAsia="Times New Roman"/>
+          <w:color w:val="000000"/>
+        </w:rPr>
+      </w:pPr>
+      <w:r>
+        <w:rPr>
+          <w:rFonts w:eastAsia="Times New Roman"/>
+          <w:color w:val="000000"/>
+        </w:rPr>
+        <w:t>composables: Encargado de gestionar la sesión del usuario</w:t>
+      </w:r>
+    </w:p>
+    <w:p>
+      <w:pPr>
+        <w:numPr>
+          <w:ilvl w:val="0"/>
+          <w:numId w:val="23"/>
+        </w:numPr>
+        <w:spacing w:after="0" w:line="240" w:lineRule="auto"/>
+        <w:jc w:val="both"/>
+        <w:textAlignment w:val="baseline"/>
+        <w:rPr>
+          <w:rFonts w:eastAsia="Times New Roman"/>
+          <w:color w:val="000000"/>
+        </w:rPr>
+      </w:pPr>
+      <w:r>
+        <w:rPr>
+          <w:rFonts w:eastAsia="Times New Roman"/>
+          <w:color w:val="000000"/>
+        </w:rPr>
+        <w:t>router: Encargado de indicar las diferentes rutas de la página</w:t>
+      </w:r>
+    </w:p>
+    <w:p>
+      <w:pPr>
+        <w:numPr>
+          <w:ilvl w:val="0"/>
+          <w:numId w:val="23"/>
+        </w:numPr>
+        <w:spacing w:after="0" w:line="240" w:lineRule="auto"/>
+        <w:jc w:val="both"/>
+        <w:textAlignment w:val="baseline"/>
+        <w:rPr>
+          <w:rFonts w:eastAsia="Times New Roman"/>
+          <w:color w:val="000000"/>
+        </w:rPr>
+      </w:pPr>
+      <w:r>
+        <w:rPr>
+          <w:rFonts w:eastAsia="Times New Roman"/>
+          <w:color w:val="000000"/>
+        </w:rPr>
+        <w:t>services: Contiene los endpoints que realizan las peticiones al back</w:t>
+      </w:r>
+    </w:p>
+    <w:p>
+      <w:pPr>
+        <w:numPr>
+          <w:ilvl w:val="0"/>
+          <w:numId w:val="23"/>
+        </w:numPr>
+        <w:spacing w:after="0" w:line="240" w:lineRule="auto"/>
+        <w:jc w:val="both"/>
+        <w:textAlignment w:val="baseline"/>
+        <w:rPr>
+          <w:rFonts w:eastAsia="Times New Roman"/>
+          <w:color w:val="000000"/>
+        </w:rPr>
+      </w:pPr>
+      <w:r>
+        <w:rPr>
+          <w:rFonts w:eastAsia="Times New Roman"/>
+          <w:color w:val="000000"/>
+        </w:rPr>
+        <w:t>theme: Encargado de modificar en gran medida los colores de Ant Desing</w:t>
+      </w:r>
+    </w:p>
+    <w:p>
+      <w:pPr>
+        <w:numPr>
+          <w:ilvl w:val="0"/>
+          <w:numId w:val="23"/>
+        </w:numPr>
+        <w:spacing w:line="240" w:lineRule="auto"/>
+        <w:jc w:val="both"/>
+        <w:textAlignment w:val="baseline"/>
+        <w:rPr>
+          <w:rFonts w:eastAsia="Times New Roman"/>
+          <w:color w:val="000000"/>
+        </w:rPr>
+      </w:pPr>
+      <w:r>
+        <w:rPr>
+          <w:rFonts w:eastAsia="Times New Roman"/>
+          <w:color w:val="000000"/>
+        </w:rPr>
+        <w:t>view: Contiene la estructura de páginas de la aplicación</w:t>
+      </w:r>
+    </w:p>
+    <w:p>
+      <w:pPr>
         <w:rPr>
           <w:b/>
           <w:sz w:val="26"/>
           <w:szCs w:val="26"/>
         </w:rPr>
       </w:pPr>
-      <w:r>
+    </w:p>
+    <w:p>
+      <w:pPr>
         <w:rPr>
           <w:b/>
           <w:sz w:val="26"/>
           <w:szCs w:val="26"/>
         </w:rPr>
-        <w:br w:type="page"/>
-      </w:r>
-    </w:p>
-    <w:p>
-      <w:pPr>
-        <w:pStyle w:val="Ttulo1"/>
-        <w:ind w:left="0" w:firstLine="0"/>
-        <w:rPr>
-          <w:rFonts w:ascii="Calibri" w:eastAsia="Arial" w:hAnsi="Calibri" w:cs="Calibri"/>
-        </w:rPr>
-      </w:pPr>
-      <w:r>
-        <w:rPr>
-          <w:rFonts w:ascii="Calibri" w:eastAsia="Arial" w:hAnsi="Calibri" w:cs="Calibri"/>
+      </w:pPr>
+    </w:p>
+    <w:p>
+      <w:pPr>
+        <w:rPr>
+          <w:b/>
+          <w:sz w:val="26"/>
+          <w:szCs w:val="26"/>
+        </w:rPr>
+      </w:pPr>
+    </w:p>
+    <w:p>
+      <w:pPr>
+        <w:rPr>
+          <w:b/>
+          <w:sz w:val="26"/>
+          <w:szCs w:val="26"/>
+        </w:rPr>
+      </w:pPr>
+    </w:p>
+    <w:p>
+      <w:pPr>
+        <w:rPr>
+          <w:b/>
+          <w:sz w:val="26"/>
+          <w:szCs w:val="26"/>
+        </w:rPr>
+      </w:pPr>
+    </w:p>
+    <w:p>
+      <w:pPr>
+        <w:rPr>
+          <w:b/>
+          <w:sz w:val="26"/>
+          <w:szCs w:val="26"/>
+        </w:rPr>
+      </w:pPr>
+    </w:p>
+    <w:p>
+      <w:pPr>
+        <w:rPr>
+          <w:b/>
+          <w:sz w:val="26"/>
+          <w:szCs w:val="26"/>
+        </w:rPr>
+      </w:pPr>
+    </w:p>
+    <w:p>
+      <w:pPr>
+        <w:rPr>
+          <w:b/>
+          <w:sz w:val="26"/>
+          <w:szCs w:val="26"/>
+        </w:rPr>
+      </w:pPr>
+    </w:p>
+    <w:p>
+      <w:pPr>
+        <w:rPr>
+          <w:b/>
+          <w:sz w:val="26"/>
+          <w:szCs w:val="26"/>
+        </w:rPr>
+      </w:pPr>
+      <w:r>
+        <w:rPr>
+          <w:b/>
+          <w:sz w:val="26"/>
+          <w:szCs w:val="26"/>
         </w:rPr>
         <w:lastRenderedPageBreak/>
+        <w:t>6.2 Librerías externas utilizadas</w:t>
+      </w:r>
+    </w:p>
+    <w:p>
+      <w:pPr>
+        <w:spacing w:before="100" w:beforeAutospacing="1" w:after="100" w:afterAutospacing="1" w:line="240" w:lineRule="auto"/>
+        <w:rPr>
+          <w:rFonts w:eastAsia="Times New Roman"/>
+          <w:i/>
+        </w:rPr>
+      </w:pPr>
+      <w:r>
+        <w:rPr>
+          <w:rFonts w:eastAsia="Times New Roman"/>
+          <w:bCs/>
+          <w:i/>
+        </w:rPr>
+        <w:t>Backend:</w:t>
+      </w:r>
+    </w:p>
+    <w:p>
+      <w:pPr>
+        <w:numPr>
+          <w:ilvl w:val="0"/>
+          <w:numId w:val="24"/>
+        </w:numPr>
+        <w:spacing w:before="100" w:beforeAutospacing="1" w:after="100" w:afterAutospacing="1" w:line="240" w:lineRule="auto"/>
+        <w:rPr>
+          <w:rFonts w:eastAsia="Times New Roman"/>
+        </w:rPr>
+      </w:pPr>
+      <w:r>
+        <w:rPr>
+          <w:rFonts w:eastAsia="Times New Roman"/>
+          <w:bCs/>
+        </w:rPr>
+        <w:t>cors</w:t>
+      </w:r>
+      <w:r>
+        <w:rPr>
+          <w:rFonts w:eastAsia="Times New Roman"/>
+        </w:rPr>
+        <w:t>: g</w:t>
+      </w:r>
+      <w:r>
+        <w:rPr>
+          <w:rFonts w:eastAsia="Times New Roman"/>
+        </w:rPr>
+        <w:t>estión de políticas de acceso entre orígenes</w:t>
+      </w:r>
+    </w:p>
+    <w:p>
+      <w:pPr>
+        <w:numPr>
+          <w:ilvl w:val="0"/>
+          <w:numId w:val="24"/>
+        </w:numPr>
+        <w:spacing w:before="100" w:beforeAutospacing="1" w:after="100" w:afterAutospacing="1" w:line="240" w:lineRule="auto"/>
+        <w:rPr>
+          <w:rFonts w:eastAsia="Times New Roman"/>
+        </w:rPr>
+      </w:pPr>
+      <w:r>
+        <w:rPr>
+          <w:rFonts w:eastAsia="Times New Roman"/>
+          <w:bCs/>
+        </w:rPr>
+        <w:t>dotenv</w:t>
+      </w:r>
+      <w:r>
+        <w:rPr>
+          <w:rFonts w:eastAsia="Times New Roman"/>
+        </w:rPr>
+        <w:t>: c</w:t>
+      </w:r>
+      <w:r>
+        <w:rPr>
+          <w:rFonts w:eastAsia="Times New Roman"/>
+        </w:rPr>
+        <w:t>arga de variables de entorno</w:t>
+      </w:r>
+    </w:p>
+    <w:p>
+      <w:pPr>
+        <w:numPr>
+          <w:ilvl w:val="0"/>
+          <w:numId w:val="24"/>
+        </w:numPr>
+        <w:spacing w:before="100" w:beforeAutospacing="1" w:after="100" w:afterAutospacing="1" w:line="240" w:lineRule="auto"/>
+        <w:rPr>
+          <w:rFonts w:eastAsia="Times New Roman"/>
+        </w:rPr>
+      </w:pPr>
+      <w:r>
+        <w:rPr>
+          <w:rFonts w:eastAsia="Times New Roman"/>
+          <w:bCs/>
+        </w:rPr>
+        <w:t>multer</w:t>
+      </w:r>
+      <w:r>
+        <w:rPr>
+          <w:rFonts w:eastAsia="Times New Roman"/>
+        </w:rPr>
+        <w:t>: g</w:t>
+      </w:r>
+      <w:r>
+        <w:rPr>
+          <w:rFonts w:eastAsia="Times New Roman"/>
+        </w:rPr>
+        <w:t>estión de subida de archivos</w:t>
+      </w:r>
+    </w:p>
+    <w:p>
+      <w:pPr>
+        <w:numPr>
+          <w:ilvl w:val="0"/>
+          <w:numId w:val="24"/>
+        </w:numPr>
+        <w:spacing w:before="100" w:beforeAutospacing="1" w:after="100" w:afterAutospacing="1" w:line="240" w:lineRule="auto"/>
+        <w:rPr>
+          <w:rFonts w:eastAsia="Times New Roman"/>
+        </w:rPr>
+      </w:pPr>
+      <w:r>
+        <w:rPr>
+          <w:rFonts w:eastAsia="Times New Roman"/>
+          <w:bCs/>
+        </w:rPr>
+        <w:t>tesseract.js</w:t>
+      </w:r>
+      <w:r>
+        <w:rPr>
+          <w:rFonts w:eastAsia="Times New Roman"/>
+        </w:rPr>
+        <w:t xml:space="preserve">: </w:t>
+      </w:r>
+      <w:r>
+        <w:rPr>
+          <w:rFonts w:eastAsia="Times New Roman"/>
+        </w:rPr>
+        <w:t>OCR para extracción de texto en imágenes</w:t>
+      </w:r>
+    </w:p>
+    <w:p>
+      <w:pPr>
+        <w:numPr>
+          <w:ilvl w:val="0"/>
+          <w:numId w:val="24"/>
+        </w:numPr>
+        <w:spacing w:before="100" w:beforeAutospacing="1" w:after="100" w:afterAutospacing="1" w:line="240" w:lineRule="auto"/>
+        <w:rPr>
+          <w:rFonts w:eastAsia="Times New Roman"/>
+        </w:rPr>
+      </w:pPr>
+      <w:r>
+        <w:rPr>
+          <w:rFonts w:eastAsia="Times New Roman"/>
+          <w:bCs/>
+        </w:rPr>
+        <w:t>nodemon</w:t>
+      </w:r>
+      <w:r>
+        <w:rPr>
+          <w:rFonts w:eastAsia="Times New Roman"/>
+        </w:rPr>
+        <w:t>: r</w:t>
+      </w:r>
+      <w:r>
+        <w:rPr>
+          <w:rFonts w:eastAsia="Times New Roman"/>
+        </w:rPr>
+        <w:t>einicio automático del servidor en desarrollo</w:t>
+      </w:r>
+    </w:p>
+    <w:p>
+      <w:pPr>
+        <w:spacing w:before="100" w:beforeAutospacing="1" w:after="100" w:afterAutospacing="1" w:line="240" w:lineRule="auto"/>
+        <w:rPr>
+          <w:rFonts w:eastAsia="Times New Roman"/>
+        </w:rPr>
+      </w:pPr>
+      <w:r>
+        <w:rPr>
+          <w:rFonts w:eastAsia="Times New Roman"/>
+          <w:bCs/>
+          <w:i/>
+        </w:rPr>
+        <w:t xml:space="preserve">Frontend: </w:t>
+      </w:r>
+    </w:p>
+    <w:p>
+      <w:pPr>
+        <w:numPr>
+          <w:ilvl w:val="0"/>
+          <w:numId w:val="24"/>
+        </w:numPr>
+        <w:spacing w:before="100" w:beforeAutospacing="1" w:after="100" w:afterAutospacing="1" w:line="240" w:lineRule="auto"/>
+        <w:rPr>
+          <w:rFonts w:eastAsia="Times New Roman"/>
+        </w:rPr>
+      </w:pPr>
+      <w:r>
+        <w:rPr>
+          <w:rFonts w:eastAsia="Times New Roman"/>
+          <w:bCs/>
+        </w:rPr>
+        <w:t>axios</w:t>
+      </w:r>
+      <w:r>
+        <w:rPr>
+          <w:rFonts w:eastAsia="Times New Roman"/>
+        </w:rPr>
+        <w:t>: cliente HTTP para comunicación con la API</w:t>
+      </w:r>
+    </w:p>
+    <w:p>
+      <w:pPr>
+        <w:numPr>
+          <w:ilvl w:val="0"/>
+          <w:numId w:val="24"/>
+        </w:numPr>
+        <w:spacing w:before="100" w:beforeAutospacing="1" w:after="100" w:afterAutospacing="1" w:line="240" w:lineRule="auto"/>
+        <w:rPr>
+          <w:rFonts w:eastAsia="Times New Roman"/>
+        </w:rPr>
+      </w:pPr>
+      <w:r>
+        <w:rPr>
+          <w:rFonts w:eastAsia="Times New Roman"/>
+          <w:bCs/>
+        </w:rPr>
+        <w:t>Ant Design Vue</w:t>
+      </w:r>
+      <w:r>
+        <w:rPr>
+          <w:rFonts w:eastAsia="Times New Roman"/>
+        </w:rPr>
+        <w:t>: librería de componentes UI</w:t>
+      </w:r>
+    </w:p>
+    <w:p>
+      <w:pPr>
+        <w:numPr>
+          <w:ilvl w:val="0"/>
+          <w:numId w:val="24"/>
+        </w:numPr>
+        <w:spacing w:before="100" w:beforeAutospacing="1" w:after="100" w:afterAutospacing="1" w:line="240" w:lineRule="auto"/>
+        <w:rPr>
+          <w:rFonts w:eastAsia="Times New Roman"/>
+        </w:rPr>
+      </w:pPr>
+      <w:r>
+        <w:rPr>
+          <w:rFonts w:eastAsia="Times New Roman"/>
+          <w:bCs/>
+        </w:rPr>
+        <w:t>@antv/g2plo</w:t>
+      </w:r>
+      <w:r>
+        <w:rPr>
+          <w:rFonts w:eastAsia="Times New Roman"/>
+        </w:rPr>
+        <w:t>: visualización de datos y gráficas</w:t>
+      </w:r>
+    </w:p>
+    <w:p>
+      <w:pPr>
+        <w:numPr>
+          <w:ilvl w:val="0"/>
+          <w:numId w:val="24"/>
+        </w:numPr>
+        <w:spacing w:before="100" w:beforeAutospacing="1" w:after="100" w:afterAutospacing="1" w:line="240" w:lineRule="auto"/>
+        <w:rPr>
+          <w:rFonts w:eastAsia="Times New Roman"/>
+        </w:rPr>
+      </w:pPr>
+      <w:r>
+        <w:rPr>
+          <w:rFonts w:eastAsia="Times New Roman"/>
+          <w:bCs/>
+        </w:rPr>
+        <w:t>crypto-js</w:t>
+      </w:r>
+      <w:r>
+        <w:rPr>
+          <w:rFonts w:eastAsia="Times New Roman"/>
+        </w:rPr>
+        <w:t>: cifrado en el lado del cliente</w:t>
+      </w:r>
+    </w:p>
+    <w:p>
+      <w:pPr>
+        <w:numPr>
+          <w:ilvl w:val="0"/>
+          <w:numId w:val="24"/>
+        </w:numPr>
+        <w:spacing w:before="100" w:beforeAutospacing="1" w:after="100" w:afterAutospacing="1" w:line="240" w:lineRule="auto"/>
+        <w:rPr>
+          <w:rFonts w:eastAsia="Times New Roman"/>
+        </w:rPr>
+      </w:pPr>
+      <w:r>
+        <w:rPr>
+          <w:rFonts w:eastAsia="Times New Roman"/>
+          <w:bCs/>
+        </w:rPr>
+        <w:t>qrcode</w:t>
+      </w:r>
+      <w:r>
+        <w:rPr>
+          <w:rFonts w:eastAsia="Times New Roman"/>
+        </w:rPr>
+        <w:t>: generación de códigos QR</w:t>
+      </w:r>
+    </w:p>
+    <w:p>
+      <w:pPr>
+        <w:numPr>
+          <w:ilvl w:val="0"/>
+          <w:numId w:val="24"/>
+        </w:numPr>
+        <w:spacing w:before="100" w:beforeAutospacing="1" w:after="100" w:afterAutospacing="1" w:line="240" w:lineRule="auto"/>
+        <w:rPr>
+          <w:rFonts w:eastAsia="Times New Roman"/>
+        </w:rPr>
+      </w:pPr>
+      <w:r>
+        <w:rPr>
+          <w:rFonts w:eastAsia="Times New Roman"/>
+          <w:bCs/>
+        </w:rPr>
+        <w:t>dayjs</w:t>
+      </w:r>
+      <w:r>
+        <w:rPr>
+          <w:rFonts w:eastAsia="Times New Roman"/>
+        </w:rPr>
+        <w:t>: manipulación y formateo de fechas</w:t>
+      </w:r>
+    </w:p>
+    <w:p>
+      <w:pPr>
+        <w:numPr>
+          <w:ilvl w:val="0"/>
+          <w:numId w:val="24"/>
+        </w:numPr>
+        <w:spacing w:before="100" w:beforeAutospacing="1" w:after="100" w:afterAutospacing="1" w:line="240" w:lineRule="auto"/>
+        <w:rPr>
+          <w:rFonts w:eastAsia="Times New Roman"/>
+        </w:rPr>
+      </w:pPr>
+      <w:r>
+        <w:rPr>
+          <w:rFonts w:eastAsia="Times New Roman"/>
+          <w:bCs/>
+        </w:rPr>
+        <w:t>vue-router</w:t>
+      </w:r>
+      <w:r>
+        <w:rPr>
+          <w:rFonts w:eastAsia="Times New Roman"/>
+        </w:rPr>
+        <w:t>: enrutado de la SPA</w:t>
+      </w:r>
+    </w:p>
+    <w:p>
+      <w:pPr>
+        <w:numPr>
+          <w:ilvl w:val="0"/>
+          <w:numId w:val="24"/>
+        </w:numPr>
+        <w:spacing w:before="100" w:beforeAutospacing="1" w:after="100" w:afterAutospacing="1" w:line="240" w:lineRule="auto"/>
+        <w:rPr>
+          <w:rFonts w:eastAsia="Times New Roman"/>
+        </w:rPr>
+      </w:pPr>
+      <w:r>
+        <w:rPr>
+          <w:rFonts w:eastAsia="Times New Roman"/>
+          <w:bCs/>
+        </w:rPr>
+        <w:t>vue-request</w:t>
+      </w:r>
+      <w:r>
+        <w:rPr>
+          <w:rFonts w:eastAsia="Times New Roman"/>
+        </w:rPr>
+        <w:t>: gestión de peticiones asíncronas</w:t>
+      </w:r>
+    </w:p>
+    <w:p>
+      <w:pPr>
+        <w:spacing w:before="100" w:beforeAutospacing="1" w:after="100" w:afterAutospacing="1" w:line="240" w:lineRule="auto"/>
+        <w:ind w:left="720"/>
+        <w:rPr>
+          <w:rFonts w:eastAsia="Times New Roman"/>
+        </w:rPr>
+      </w:pPr>
+    </w:p>
+    <w:p>
+      <w:pPr>
+        <w:rPr>
+          <w:b/>
+          <w:sz w:val="32"/>
+          <w:szCs w:val="32"/>
+        </w:rPr>
+      </w:pPr>
+      <w:r>
+        <w:rPr>
+          <w:rFonts w:eastAsia="Arial"/>
+          <w:b/>
+          <w:sz w:val="32"/>
+          <w:szCs w:val="32"/>
+        </w:rPr>
         <w:t>7</w:t>
       </w:r>
       <w:r>
         <w:rPr>
-          <w:rFonts w:ascii="Calibri" w:eastAsia="Arial" w:hAnsi="Calibri" w:cs="Calibri"/>
+          <w:rFonts w:eastAsia="Arial"/>
+          <w:b/>
+          <w:sz w:val="32"/>
+          <w:szCs w:val="32"/>
         </w:rPr>
         <w:t xml:space="preserve">. </w:t>
       </w:r>
       <w:r>
         <w:rPr>
-          <w:rFonts w:ascii="Calibri" w:eastAsia="Arial" w:hAnsi="Calibri" w:cs="Calibri"/>
+          <w:rFonts w:eastAsia="Arial"/>
+          <w:b/>
+          <w:sz w:val="32"/>
+          <w:szCs w:val="32"/>
         </w:rPr>
         <w:t>Manual de despliegue</w:t>
       </w:r>
@@ -14235,6 +15138,7 @@
           <w:rFonts w:eastAsia="Times New Roman"/>
           <w:color w:val="000000"/>
         </w:rPr>
+        <w:lastRenderedPageBreak/>
         <w:t xml:space="preserve">Comenzaremos el despliegue descargando las imágenes del dockerhub </w:t>
       </w:r>
       <w:r>
@@ -14270,21 +15174,222 @@
     </w:p>
     <w:p>
       <w:pPr>
+        <w:pStyle w:val="Prrafodelista"/>
+        <w:spacing w:after="60" w:line="240" w:lineRule="auto"/>
+        <w:jc w:val="both"/>
+        <w:textAlignment w:val="baseline"/>
+        <w:rPr>
+          <w:rFonts w:eastAsia="Times New Roman"/>
+          <w:color w:val="000000"/>
+        </w:rPr>
+      </w:pPr>
+      <w:r>
+        <w:rPr>
+          <w:rFonts w:eastAsia="Times New Roman"/>
+          <w:noProof/>
+          <w:color w:val="000000"/>
+        </w:rPr>
+        <w:drawing>
+          <wp:anchor distT="0" distB="0" distL="114300" distR="114300" simplePos="0" relativeHeight="251664896" behindDoc="0" locked="0" layoutInCell="1" allowOverlap="1">
+            <wp:simplePos x="0" y="0"/>
+            <wp:positionH relativeFrom="column">
+              <wp:posOffset>-44450</wp:posOffset>
+            </wp:positionH>
+            <wp:positionV relativeFrom="paragraph">
+              <wp:posOffset>284480</wp:posOffset>
+            </wp:positionV>
+            <wp:extent cx="5537200" cy="848360"/>
+            <wp:effectExtent l="19050" t="0" r="6350" b="0"/>
+            <wp:wrapThrough wrapText="bothSides">
+              <wp:wrapPolygon edited="0">
+                <wp:start x="-74" y="0"/>
+                <wp:lineTo x="-74" y="21341"/>
+                <wp:lineTo x="21625" y="21341"/>
+                <wp:lineTo x="21625" y="0"/>
+                <wp:lineTo x="-74" y="0"/>
+              </wp:wrapPolygon>
+            </wp:wrapThrough>
+            <wp:docPr id="8" name="Imagen 7"/>
+            <wp:cNvGraphicFramePr>
+              <a:graphicFrameLocks xmlns:a="http://schemas.openxmlformats.org/drawingml/2006/main" noChangeAspect="1"/>
+            </wp:cNvGraphicFramePr>
+            <a:graphic xmlns:a="http://schemas.openxmlformats.org/drawingml/2006/main">
+              <a:graphicData uri="http://schemas.openxmlformats.org/drawingml/2006/picture">
+                <pic:pic xmlns:pic="http://schemas.openxmlformats.org/drawingml/2006/picture">
+                  <pic:nvPicPr>
+                    <pic:cNvPr id="0" name="Picture 7"/>
+                    <pic:cNvPicPr>
+                      <a:picLocks noChangeAspect="1" noChangeArrowheads="1"/>
+                    </pic:cNvPicPr>
+                  </pic:nvPicPr>
+                  <pic:blipFill>
+                    <a:blip r:embed="rId22"/>
+                    <a:srcRect/>
+                    <a:stretch>
+                      <a:fillRect/>
+                    </a:stretch>
+                  </pic:blipFill>
+                  <pic:spPr bwMode="auto">
+                    <a:xfrm>
+                      <a:off x="0" y="0"/>
+                      <a:ext cx="5537200" cy="848360"/>
+                    </a:xfrm>
+                    <a:prstGeom prst="rect">
+                      <a:avLst/>
+                    </a:prstGeom>
+                    <a:noFill/>
+                    <a:ln w="9525">
+                      <a:noFill/>
+                      <a:miter lim="800000"/>
+                      <a:headEnd/>
+                      <a:tailEnd/>
+                    </a:ln>
+                  </pic:spPr>
+                </pic:pic>
+              </a:graphicData>
+            </a:graphic>
+          </wp:anchor>
+        </w:drawing>
+      </w:r>
+    </w:p>
+    <w:p>
+      <w:pPr>
+        <w:pStyle w:val="Prrafodelista"/>
+        <w:spacing w:after="60" w:line="240" w:lineRule="auto"/>
+        <w:jc w:val="both"/>
+        <w:textAlignment w:val="baseline"/>
+        <w:rPr>
+          <w:rFonts w:eastAsia="Times New Roman"/>
+          <w:color w:val="000000"/>
+        </w:rPr>
+      </w:pPr>
+      <w:r>
+        <w:rPr>
+          <w:rFonts w:eastAsia="Times New Roman"/>
+          <w:noProof/>
+          <w:color w:val="000000"/>
+        </w:rPr>
+        <w:drawing>
+          <wp:anchor distT="0" distB="0" distL="114300" distR="114300" simplePos="0" relativeHeight="251665920" behindDoc="0" locked="0" layoutInCell="1" allowOverlap="1">
+            <wp:simplePos x="0" y="0"/>
+            <wp:positionH relativeFrom="column">
+              <wp:posOffset>-8255</wp:posOffset>
+            </wp:positionH>
+            <wp:positionV relativeFrom="paragraph">
+              <wp:posOffset>281940</wp:posOffset>
+            </wp:positionV>
+            <wp:extent cx="5441950" cy="811530"/>
+            <wp:effectExtent l="19050" t="0" r="6350" b="0"/>
+            <wp:wrapThrough wrapText="bothSides">
+              <wp:wrapPolygon edited="0">
+                <wp:start x="-76" y="0"/>
+                <wp:lineTo x="-76" y="21296"/>
+                <wp:lineTo x="21625" y="21296"/>
+                <wp:lineTo x="21625" y="0"/>
+                <wp:lineTo x="-76" y="0"/>
+              </wp:wrapPolygon>
+            </wp:wrapThrough>
+            <wp:docPr id="10" name="Imagen 10"/>
+            <wp:cNvGraphicFramePr>
+              <a:graphicFrameLocks xmlns:a="http://schemas.openxmlformats.org/drawingml/2006/main" noChangeAspect="1"/>
+            </wp:cNvGraphicFramePr>
+            <a:graphic xmlns:a="http://schemas.openxmlformats.org/drawingml/2006/main">
+              <a:graphicData uri="http://schemas.openxmlformats.org/drawingml/2006/picture">
+                <pic:pic xmlns:pic="http://schemas.openxmlformats.org/drawingml/2006/picture">
+                  <pic:nvPicPr>
+                    <pic:cNvPr id="0" name="Picture 10"/>
+                    <pic:cNvPicPr>
+                      <a:picLocks noChangeAspect="1" noChangeArrowheads="1"/>
+                    </pic:cNvPicPr>
+                  </pic:nvPicPr>
+                  <pic:blipFill>
+                    <a:blip r:embed="rId23"/>
+                    <a:srcRect/>
+                    <a:stretch>
+                      <a:fillRect/>
+                    </a:stretch>
+                  </pic:blipFill>
+                  <pic:spPr bwMode="auto">
+                    <a:xfrm>
+                      <a:off x="0" y="0"/>
+                      <a:ext cx="5441950" cy="811530"/>
+                    </a:xfrm>
+                    <a:prstGeom prst="rect">
+                      <a:avLst/>
+                    </a:prstGeom>
+                    <a:noFill/>
+                    <a:ln w="9525">
+                      <a:noFill/>
+                      <a:miter lim="800000"/>
+                      <a:headEnd/>
+                      <a:tailEnd/>
+                    </a:ln>
+                  </pic:spPr>
+                </pic:pic>
+              </a:graphicData>
+            </a:graphic>
+          </wp:anchor>
+        </w:drawing>
+      </w:r>
+    </w:p>
+    <w:p>
+      <w:pPr>
+        <w:spacing w:before="60" w:after="60" w:line="240" w:lineRule="auto"/>
+        <w:jc w:val="both"/>
+        <w:rPr>
+          <w:rFonts w:eastAsia="Times New Roman"/>
+          <w:i/>
+          <w:lang w:val="en-GB"/>
+        </w:rPr>
+      </w:pPr>
+    </w:p>
+    <w:p>
+      <w:pPr>
+        <w:spacing w:before="60" w:after="60" w:line="240" w:lineRule="auto"/>
+        <w:jc w:val="both"/>
+        <w:rPr>
+          <w:rFonts w:eastAsia="Times New Roman"/>
+          <w:i/>
+          <w:lang w:val="en-GB"/>
+        </w:rPr>
+      </w:pPr>
+      <w:r>
+        <w:rPr>
+          <w:rFonts w:eastAsia="Times New Roman"/>
+          <w:i/>
+          <w:lang w:val="en-GB"/>
+        </w:rPr>
+        <w:t>Docker-compose.yml</w:t>
+      </w:r>
+    </w:p>
+    <w:p>
+      <w:pPr>
         <w:spacing w:before="60" w:after="60" w:line="240" w:lineRule="auto"/>
         <w:ind w:left="720"/>
         <w:jc w:val="both"/>
         <w:rPr>
           <w:rFonts w:eastAsia="Times New Roman"/>
-          <w:i/>
-        </w:rPr>
-      </w:pPr>
-      <w:r>
-        <w:rPr>
-          <w:rFonts w:eastAsia="Times New Roman"/>
-          <w:i/>
-        </w:rPr>
-        <w:t>Docker-compose.yml</w:t>
-      </w:r>
+          <w:lang w:val="en-GB"/>
+        </w:rPr>
+      </w:pPr>
+      <w:r>
+        <w:rPr>
+          <w:rFonts w:eastAsia="Times New Roman"/>
+          <w:color w:val="000000"/>
+          <w:lang w:val="en-GB"/>
+        </w:rPr>
+        <w:t>version: '3.8'</w:t>
+      </w:r>
+    </w:p>
+    <w:p>
+      <w:pPr>
+        <w:spacing w:after="0" w:line="240" w:lineRule="auto"/>
+        <w:jc w:val="both"/>
+        <w:rPr>
+          <w:rFonts w:eastAsia="Times New Roman"/>
+          <w:lang w:val="en-GB"/>
+        </w:rPr>
+      </w:pPr>
     </w:p>
     <w:p>
       <w:pPr>
@@ -14302,18 +15407,8 @@
           <w:color w:val="000000"/>
           <w:lang w:val="en-GB"/>
         </w:rPr>
-        <w:t>version: '3.8'</w:t>
-      </w:r>
-    </w:p>
-    <w:p>
-      <w:pPr>
-        <w:spacing w:after="0" w:line="240" w:lineRule="auto"/>
-        <w:jc w:val="both"/>
-        <w:rPr>
-          <w:rFonts w:eastAsia="Times New Roman"/>
-          <w:lang w:val="en-GB"/>
-        </w:rPr>
-      </w:pPr>
+        <w:t>services:</w:t>
+      </w:r>
     </w:p>
     <w:p>
       <w:pPr>
@@ -14331,7 +15426,7 @@
           <w:color w:val="000000"/>
           <w:lang w:val="en-GB"/>
         </w:rPr>
-        <w:t>services:</w:t>
+        <w:t>  backend:</w:t>
       </w:r>
     </w:p>
     <w:p>
@@ -14350,7 +15445,7 @@
           <w:color w:val="000000"/>
           <w:lang w:val="en-GB"/>
         </w:rPr>
-        <w:t>  backend:</w:t>
+        <w:t>    build: ./backend</w:t>
       </w:r>
     </w:p>
     <w:p>
@@ -14369,7 +15464,7 @@
           <w:color w:val="000000"/>
           <w:lang w:val="en-GB"/>
         </w:rPr>
-        <w:t>    build: ./backend</w:t>
+        <w:t>    ports:</w:t>
       </w:r>
     </w:p>
     <w:p>
@@ -14388,7 +15483,7 @@
           <w:color w:val="000000"/>
           <w:lang w:val="en-GB"/>
         </w:rPr>
-        <w:t>    ports:</w:t>
+        <w:t>      - "5000:5000"</w:t>
       </w:r>
     </w:p>
     <w:p>
@@ -14407,7 +15502,7 @@
           <w:color w:val="000000"/>
           <w:lang w:val="en-GB"/>
         </w:rPr>
-        <w:t>      - "5000:5000"</w:t>
+        <w:t>    volumes:</w:t>
       </w:r>
     </w:p>
     <w:p>
@@ -14426,7 +15521,7 @@
           <w:color w:val="000000"/>
           <w:lang w:val="en-GB"/>
         </w:rPr>
-        <w:t>    volumes:</w:t>
+        <w:t>      - ./backend/utils/db:/app/utils/db</w:t>
       </w:r>
     </w:p>
     <w:p>
@@ -14445,7 +15540,7 @@
           <w:color w:val="000000"/>
           <w:lang w:val="en-GB"/>
         </w:rPr>
-        <w:t>      - ./backend/utils/db:/app/utils/db</w:t>
+        <w:t>      - ./backend/.env:/app/.env</w:t>
       </w:r>
     </w:p>
     <w:p>
@@ -14464,7 +15559,7 @@
           <w:color w:val="000000"/>
           <w:lang w:val="en-GB"/>
         </w:rPr>
-        <w:t>      - ./backend/.env:/app/.env</w:t>
+        <w:t>    environment:</w:t>
       </w:r>
     </w:p>
     <w:p>
@@ -14483,8 +15578,18 @@
           <w:color w:val="000000"/>
           <w:lang w:val="en-GB"/>
         </w:rPr>
-        <w:t>    environment:</w:t>
-      </w:r>
+        <w:t>      - PORT=5000</w:t>
+      </w:r>
+    </w:p>
+    <w:p>
+      <w:pPr>
+        <w:spacing w:after="0" w:line="240" w:lineRule="auto"/>
+        <w:jc w:val="both"/>
+        <w:rPr>
+          <w:rFonts w:eastAsia="Times New Roman"/>
+          <w:lang w:val="en-GB"/>
+        </w:rPr>
+      </w:pPr>
     </w:p>
     <w:p>
       <w:pPr>
@@ -14502,19 +15607,8 @@
           <w:color w:val="000000"/>
           <w:lang w:val="en-GB"/>
         </w:rPr>
-        <w:lastRenderedPageBreak/>
-        <w:t>      - PORT=5000</w:t>
-      </w:r>
-    </w:p>
-    <w:p>
-      <w:pPr>
-        <w:spacing w:after="0" w:line="240" w:lineRule="auto"/>
-        <w:jc w:val="both"/>
-        <w:rPr>
-          <w:rFonts w:eastAsia="Times New Roman"/>
-          <w:lang w:val="en-GB"/>
-        </w:rPr>
-      </w:pPr>
+        <w:t>  frontend:</w:t>
+      </w:r>
     </w:p>
     <w:p>
       <w:pPr>
@@ -14532,7 +15626,7 @@
           <w:color w:val="000000"/>
           <w:lang w:val="en-GB"/>
         </w:rPr>
-        <w:t>  frontend:</w:t>
+        <w:t>    build:</w:t>
       </w:r>
     </w:p>
     <w:p>
@@ -14551,7 +15645,7 @@
           <w:color w:val="000000"/>
           <w:lang w:val="en-GB"/>
         </w:rPr>
-        <w:t>    build:</w:t>
+        <w:t>      context: ./frontend</w:t>
       </w:r>
     </w:p>
     <w:p>
@@ -14570,7 +15664,7 @@
           <w:color w:val="000000"/>
           <w:lang w:val="en-GB"/>
         </w:rPr>
-        <w:t>      context: ./frontend</w:t>
+        <w:t>      args:</w:t>
       </w:r>
     </w:p>
     <w:p>
@@ -14589,7 +15683,7 @@
           <w:color w:val="000000"/>
           <w:lang w:val="en-GB"/>
         </w:rPr>
-        <w:t>      args:</w:t>
+        <w:t>        - VITE_API_URL=http://192.168.1.66:5000</w:t>
       </w:r>
     </w:p>
     <w:p>
@@ -14608,7 +15702,7 @@
           <w:color w:val="000000"/>
           <w:lang w:val="en-GB"/>
         </w:rPr>
-        <w:t>        - VITE_API_URL=http://192.168.1.66:5000</w:t>
+        <w:t>        - VITE_FRONTEND_URL=http://192.168.1.66:5173</w:t>
       </w:r>
     </w:p>
     <w:p>
@@ -14618,7 +15712,6 @@
         <w:jc w:val="both"/>
         <w:rPr>
           <w:rFonts w:eastAsia="Times New Roman"/>
-          <w:lang w:val="en-GB"/>
         </w:rPr>
       </w:pPr>
       <w:r>
@@ -14627,7 +15720,14 @@
           <w:color w:val="000000"/>
           <w:lang w:val="en-GB"/>
         </w:rPr>
-        <w:t>        - VITE_FRONTEND_URL=http://192.168.1.66:5173</w:t>
+        <w:t>        </w:t>
+      </w:r>
+      <w:r>
+        <w:rPr>
+          <w:rFonts w:eastAsia="Times New Roman"/>
+          <w:color w:val="000000"/>
+        </w:rPr>
+        <w:t>- VITE_QR_SECRET=clave_secreta_compartida_con_backend</w:t>
       </w:r>
     </w:p>
     <w:p>
@@ -14643,16 +15743,9 @@
         <w:rPr>
           <w:rFonts w:eastAsia="Times New Roman"/>
           <w:color w:val="000000"/>
-          <w:lang w:val="en-GB"/>
-        </w:rPr>
-        <w:t>        </w:t>
-      </w:r>
-      <w:r>
-        <w:rPr>
-          <w:rFonts w:eastAsia="Times New Roman"/>
-          <w:color w:val="000000"/>
-        </w:rPr>
-        <w:t>- VITE_QR_SECRET=clave_secreta_compartida_con_backend</w:t>
+        </w:rPr>
+        <w:lastRenderedPageBreak/>
+        <w:t>    ports:</w:t>
       </w:r>
     </w:p>
     <w:p>
@@ -14669,23 +15762,6 @@
           <w:rFonts w:eastAsia="Times New Roman"/>
           <w:color w:val="000000"/>
         </w:rPr>
-        <w:t>    ports:</w:t>
-      </w:r>
-    </w:p>
-    <w:p>
-      <w:pPr>
-        <w:spacing w:before="60" w:after="60" w:line="240" w:lineRule="auto"/>
-        <w:ind w:left="720"/>
-        <w:jc w:val="both"/>
-        <w:rPr>
-          <w:rFonts w:eastAsia="Times New Roman"/>
-        </w:rPr>
-      </w:pPr>
-      <w:r>
-        <w:rPr>
-          <w:rFonts w:eastAsia="Times New Roman"/>
-          <w:color w:val="000000"/>
-        </w:rPr>
         <w:t>      - "5173:5173"</w:t>
       </w:r>
     </w:p>
@@ -15193,7 +16269,6 @@
           <w:color w:val="000000"/>
           <w:lang w:val="en-GB"/>
         </w:rPr>
-        <w:lastRenderedPageBreak/>
         <w:t>COPY package*.json ./</w:t>
       </w:r>
     </w:p>
@@ -15338,6 +16413,7 @@
           <w:color w:val="000000"/>
           <w:lang w:val="en-GB"/>
         </w:rPr>
+        <w:lastRenderedPageBreak/>
         <w:t>ENV VITE_FRONTEND_URL=$VITE_FRONTEND_URL</w:t>
       </w:r>
     </w:p>
@@ -15730,7 +16806,7 @@
         <w:noProof/>
         <w:color w:val="041C2C"/>
       </w:rPr>
-      <w:t>19</w:t>
+      <w:t>6</w:t>
     </w:r>
     <w:r>
       <w:rPr>
@@ -15793,7 +16869,7 @@
         <w:noProof/>
         <w:color w:val="041C2C"/>
       </w:rPr>
-      <w:t>18</w:t>
+      <w:t>3</w:t>
     </w:r>
     <w:r>
       <w:rPr>
@@ -16399,6 +17475,155 @@
     </w:lvl>
   </w:abstractNum>
   <w:abstractNum w:abstractNumId="4">
+    <w:nsid w:val="1A2E12D6"/>
+    <w:multiLevelType w:val="multilevel"/>
+    <w:tmpl w:val="508695AC"/>
+    <w:lvl w:ilvl="0">
+      <w:start w:val="1"/>
+      <w:numFmt w:val="bullet"/>
+      <w:lvlText w:val="-"/>
+      <w:lvlJc w:val="left"/>
+      <w:pPr>
+        <w:tabs>
+          <w:tab w:val="num" w:pos="720"/>
+        </w:tabs>
+        <w:ind w:left="720" w:hanging="360"/>
+      </w:pPr>
+      <w:rPr>
+        <w:rFonts w:ascii="Calibri" w:hAnsi="Calibri" w:hint="default"/>
+        <w:sz w:val="20"/>
+      </w:rPr>
+    </w:lvl>
+    <w:lvl w:ilvl="1" w:tentative="1">
+      <w:start w:val="1"/>
+      <w:numFmt w:val="bullet"/>
+      <w:lvlText w:val="o"/>
+      <w:lvlJc w:val="left"/>
+      <w:pPr>
+        <w:tabs>
+          <w:tab w:val="num" w:pos="1440"/>
+        </w:tabs>
+        <w:ind w:left="1440" w:hanging="360"/>
+      </w:pPr>
+      <w:rPr>
+        <w:rFonts w:ascii="Courier New" w:hAnsi="Courier New" w:hint="default"/>
+        <w:sz w:val="20"/>
+      </w:rPr>
+    </w:lvl>
+    <w:lvl w:ilvl="2" w:tentative="1">
+      <w:start w:val="1"/>
+      <w:numFmt w:val="bullet"/>
+      <w:lvlText w:val=""/>
+      <w:lvlJc w:val="left"/>
+      <w:pPr>
+        <w:tabs>
+          <w:tab w:val="num" w:pos="2160"/>
+        </w:tabs>
+        <w:ind w:left="2160" w:hanging="360"/>
+      </w:pPr>
+      <w:rPr>
+        <w:rFonts w:ascii="Wingdings" w:hAnsi="Wingdings" w:hint="default"/>
+        <w:sz w:val="20"/>
+      </w:rPr>
+    </w:lvl>
+    <w:lvl w:ilvl="3" w:tentative="1">
+      <w:start w:val="1"/>
+      <w:numFmt w:val="bullet"/>
+      <w:lvlText w:val=""/>
+      <w:lvlJc w:val="left"/>
+      <w:pPr>
+        <w:tabs>
+          <w:tab w:val="num" w:pos="2880"/>
+        </w:tabs>
+        <w:ind w:left="2880" w:hanging="360"/>
+      </w:pPr>
+      <w:rPr>
+        <w:rFonts w:ascii="Wingdings" w:hAnsi="Wingdings" w:hint="default"/>
+        <w:sz w:val="20"/>
+      </w:rPr>
+    </w:lvl>
+    <w:lvl w:ilvl="4" w:tentative="1">
+      <w:start w:val="1"/>
+      <w:numFmt w:val="bullet"/>
+      <w:lvlText w:val=""/>
+      <w:lvlJc w:val="left"/>
+      <w:pPr>
+        <w:tabs>
+          <w:tab w:val="num" w:pos="3600"/>
+        </w:tabs>
+        <w:ind w:left="3600" w:hanging="360"/>
+      </w:pPr>
+      <w:rPr>
+        <w:rFonts w:ascii="Wingdings" w:hAnsi="Wingdings" w:hint="default"/>
+        <w:sz w:val="20"/>
+      </w:rPr>
+    </w:lvl>
+    <w:lvl w:ilvl="5" w:tentative="1">
+      <w:start w:val="1"/>
+      <w:numFmt w:val="bullet"/>
+      <w:lvlText w:val=""/>
+      <w:lvlJc w:val="left"/>
+      <w:pPr>
+        <w:tabs>
+          <w:tab w:val="num" w:pos="4320"/>
+        </w:tabs>
+        <w:ind w:left="4320" w:hanging="360"/>
+      </w:pPr>
+      <w:rPr>
+        <w:rFonts w:ascii="Wingdings" w:hAnsi="Wingdings" w:hint="default"/>
+        <w:sz w:val="20"/>
+      </w:rPr>
+    </w:lvl>
+    <w:lvl w:ilvl="6" w:tentative="1">
+      <w:start w:val="1"/>
+      <w:numFmt w:val="bullet"/>
+      <w:lvlText w:val=""/>
+      <w:lvlJc w:val="left"/>
+      <w:pPr>
+        <w:tabs>
+          <w:tab w:val="num" w:pos="5040"/>
+        </w:tabs>
+        <w:ind w:left="5040" w:hanging="360"/>
+      </w:pPr>
+      <w:rPr>
+        <w:rFonts w:ascii="Wingdings" w:hAnsi="Wingdings" w:hint="default"/>
+        <w:sz w:val="20"/>
+      </w:rPr>
+    </w:lvl>
+    <w:lvl w:ilvl="7" w:tentative="1">
+      <w:start w:val="1"/>
+      <w:numFmt w:val="bullet"/>
+      <w:lvlText w:val=""/>
+      <w:lvlJc w:val="left"/>
+      <w:pPr>
+        <w:tabs>
+          <w:tab w:val="num" w:pos="5760"/>
+        </w:tabs>
+        <w:ind w:left="5760" w:hanging="360"/>
+      </w:pPr>
+      <w:rPr>
+        <w:rFonts w:ascii="Wingdings" w:hAnsi="Wingdings" w:hint="default"/>
+        <w:sz w:val="20"/>
+      </w:rPr>
+    </w:lvl>
+    <w:lvl w:ilvl="8" w:tentative="1">
+      <w:start w:val="1"/>
+      <w:numFmt w:val="bullet"/>
+      <w:lvlText w:val=""/>
+      <w:lvlJc w:val="left"/>
+      <w:pPr>
+        <w:tabs>
+          <w:tab w:val="num" w:pos="6480"/>
+        </w:tabs>
+        <w:ind w:left="6480" w:hanging="360"/>
+      </w:pPr>
+      <w:rPr>
+        <w:rFonts w:ascii="Wingdings" w:hAnsi="Wingdings" w:hint="default"/>
+        <w:sz w:val="20"/>
+      </w:rPr>
+    </w:lvl>
+  </w:abstractNum>
+  <w:abstractNum w:abstractNumId="5">
     <w:nsid w:val="2E790E3D"/>
     <w:multiLevelType w:val="multilevel"/>
     <w:tmpl w:val="EAECFF32"/>
@@ -16547,7 +17772,7 @@
       </w:rPr>
     </w:lvl>
   </w:abstractNum>
-  <w:abstractNum w:abstractNumId="5">
+  <w:abstractNum w:abstractNumId="6">
     <w:nsid w:val="2EDF5F34"/>
     <w:multiLevelType w:val="multilevel"/>
     <w:tmpl w:val="4E102CA4"/>
@@ -16696,7 +17921,7 @@
       </w:rPr>
     </w:lvl>
   </w:abstractNum>
-  <w:abstractNum w:abstractNumId="6">
+  <w:abstractNum w:abstractNumId="7">
     <w:nsid w:val="33C0066B"/>
     <w:multiLevelType w:val="multilevel"/>
     <w:tmpl w:val="D8524AD2"/>
@@ -16782,7 +18007,7 @@
       </w:pPr>
     </w:lvl>
   </w:abstractNum>
-  <w:abstractNum w:abstractNumId="7">
+  <w:abstractNum w:abstractNumId="8">
     <w:nsid w:val="36CF6C2D"/>
     <w:multiLevelType w:val="multilevel"/>
     <w:tmpl w:val="9258DA0C"/>
@@ -16895,7 +18120,7 @@
       </w:rPr>
     </w:lvl>
   </w:abstractNum>
-  <w:abstractNum w:abstractNumId="8">
+  <w:abstractNum w:abstractNumId="9">
     <w:nsid w:val="372F3BAE"/>
     <w:multiLevelType w:val="multilevel"/>
     <w:tmpl w:val="8B4EB092"/>
@@ -17010,7 +18235,7 @@
       </w:rPr>
     </w:lvl>
   </w:abstractNum>
-  <w:abstractNum w:abstractNumId="9">
+  <w:abstractNum w:abstractNumId="10">
     <w:nsid w:val="3B567FB1"/>
     <w:multiLevelType w:val="multilevel"/>
     <w:tmpl w:val="DD942AB8"/>
@@ -17159,7 +18384,305 @@
       </w:rPr>
     </w:lvl>
   </w:abstractNum>
-  <w:abstractNum w:abstractNumId="10">
+  <w:abstractNum w:abstractNumId="11">
+    <w:nsid w:val="41411801"/>
+    <w:multiLevelType w:val="multilevel"/>
+    <w:tmpl w:val="93FC8E96"/>
+    <w:lvl w:ilvl="0">
+      <w:start w:val="1"/>
+      <w:numFmt w:val="bullet"/>
+      <w:lvlText w:val="-"/>
+      <w:lvlJc w:val="left"/>
+      <w:pPr>
+        <w:tabs>
+          <w:tab w:val="num" w:pos="720"/>
+        </w:tabs>
+        <w:ind w:left="720" w:hanging="360"/>
+      </w:pPr>
+      <w:rPr>
+        <w:rFonts w:ascii="Calibri" w:hAnsi="Calibri" w:hint="default"/>
+        <w:sz w:val="20"/>
+      </w:rPr>
+    </w:lvl>
+    <w:lvl w:ilvl="1" w:tentative="1">
+      <w:start w:val="1"/>
+      <w:numFmt w:val="bullet"/>
+      <w:lvlText w:val="o"/>
+      <w:lvlJc w:val="left"/>
+      <w:pPr>
+        <w:tabs>
+          <w:tab w:val="num" w:pos="1440"/>
+        </w:tabs>
+        <w:ind w:left="1440" w:hanging="360"/>
+      </w:pPr>
+      <w:rPr>
+        <w:rFonts w:ascii="Courier New" w:hAnsi="Courier New" w:hint="default"/>
+        <w:sz w:val="20"/>
+      </w:rPr>
+    </w:lvl>
+    <w:lvl w:ilvl="2" w:tentative="1">
+      <w:start w:val="1"/>
+      <w:numFmt w:val="bullet"/>
+      <w:lvlText w:val=""/>
+      <w:lvlJc w:val="left"/>
+      <w:pPr>
+        <w:tabs>
+          <w:tab w:val="num" w:pos="2160"/>
+        </w:tabs>
+        <w:ind w:left="2160" w:hanging="360"/>
+      </w:pPr>
+      <w:rPr>
+        <w:rFonts w:ascii="Wingdings" w:hAnsi="Wingdings" w:hint="default"/>
+        <w:sz w:val="20"/>
+      </w:rPr>
+    </w:lvl>
+    <w:lvl w:ilvl="3" w:tentative="1">
+      <w:start w:val="1"/>
+      <w:numFmt w:val="bullet"/>
+      <w:lvlText w:val=""/>
+      <w:lvlJc w:val="left"/>
+      <w:pPr>
+        <w:tabs>
+          <w:tab w:val="num" w:pos="2880"/>
+        </w:tabs>
+        <w:ind w:left="2880" w:hanging="360"/>
+      </w:pPr>
+      <w:rPr>
+        <w:rFonts w:ascii="Wingdings" w:hAnsi="Wingdings" w:hint="default"/>
+        <w:sz w:val="20"/>
+      </w:rPr>
+    </w:lvl>
+    <w:lvl w:ilvl="4" w:tentative="1">
+      <w:start w:val="1"/>
+      <w:numFmt w:val="bullet"/>
+      <w:lvlText w:val=""/>
+      <w:lvlJc w:val="left"/>
+      <w:pPr>
+        <w:tabs>
+          <w:tab w:val="num" w:pos="3600"/>
+        </w:tabs>
+        <w:ind w:left="3600" w:hanging="360"/>
+      </w:pPr>
+      <w:rPr>
+        <w:rFonts w:ascii="Wingdings" w:hAnsi="Wingdings" w:hint="default"/>
+        <w:sz w:val="20"/>
+      </w:rPr>
+    </w:lvl>
+    <w:lvl w:ilvl="5" w:tentative="1">
+      <w:start w:val="1"/>
+      <w:numFmt w:val="bullet"/>
+      <w:lvlText w:val=""/>
+      <w:lvlJc w:val="left"/>
+      <w:pPr>
+        <w:tabs>
+          <w:tab w:val="num" w:pos="4320"/>
+        </w:tabs>
+        <w:ind w:left="4320" w:hanging="360"/>
+      </w:pPr>
+      <w:rPr>
+        <w:rFonts w:ascii="Wingdings" w:hAnsi="Wingdings" w:hint="default"/>
+        <w:sz w:val="20"/>
+      </w:rPr>
+    </w:lvl>
+    <w:lvl w:ilvl="6" w:tentative="1">
+      <w:start w:val="1"/>
+      <w:numFmt w:val="bullet"/>
+      <w:lvlText w:val=""/>
+      <w:lvlJc w:val="left"/>
+      <w:pPr>
+        <w:tabs>
+          <w:tab w:val="num" w:pos="5040"/>
+        </w:tabs>
+        <w:ind w:left="5040" w:hanging="360"/>
+      </w:pPr>
+      <w:rPr>
+        <w:rFonts w:ascii="Wingdings" w:hAnsi="Wingdings" w:hint="default"/>
+        <w:sz w:val="20"/>
+      </w:rPr>
+    </w:lvl>
+    <w:lvl w:ilvl="7" w:tentative="1">
+      <w:start w:val="1"/>
+      <w:numFmt w:val="bullet"/>
+      <w:lvlText w:val=""/>
+      <w:lvlJc w:val="left"/>
+      <w:pPr>
+        <w:tabs>
+          <w:tab w:val="num" w:pos="5760"/>
+        </w:tabs>
+        <w:ind w:left="5760" w:hanging="360"/>
+      </w:pPr>
+      <w:rPr>
+        <w:rFonts w:ascii="Wingdings" w:hAnsi="Wingdings" w:hint="default"/>
+        <w:sz w:val="20"/>
+      </w:rPr>
+    </w:lvl>
+    <w:lvl w:ilvl="8" w:tentative="1">
+      <w:start w:val="1"/>
+      <w:numFmt w:val="bullet"/>
+      <w:lvlText w:val=""/>
+      <w:lvlJc w:val="left"/>
+      <w:pPr>
+        <w:tabs>
+          <w:tab w:val="num" w:pos="6480"/>
+        </w:tabs>
+        <w:ind w:left="6480" w:hanging="360"/>
+      </w:pPr>
+      <w:rPr>
+        <w:rFonts w:ascii="Wingdings" w:hAnsi="Wingdings" w:hint="default"/>
+        <w:sz w:val="20"/>
+      </w:rPr>
+    </w:lvl>
+  </w:abstractNum>
+  <w:abstractNum w:abstractNumId="12">
+    <w:nsid w:val="4426399A"/>
+    <w:multiLevelType w:val="multilevel"/>
+    <w:tmpl w:val="9A4C0384"/>
+    <w:lvl w:ilvl="0">
+      <w:start w:val="1"/>
+      <w:numFmt w:val="bullet"/>
+      <w:lvlText w:val="-"/>
+      <w:lvlJc w:val="left"/>
+      <w:pPr>
+        <w:tabs>
+          <w:tab w:val="num" w:pos="720"/>
+        </w:tabs>
+        <w:ind w:left="720" w:hanging="360"/>
+      </w:pPr>
+      <w:rPr>
+        <w:rFonts w:ascii="Calibri" w:hAnsi="Calibri" w:hint="default"/>
+        <w:sz w:val="20"/>
+      </w:rPr>
+    </w:lvl>
+    <w:lvl w:ilvl="1" w:tentative="1">
+      <w:start w:val="1"/>
+      <w:numFmt w:val="bullet"/>
+      <w:lvlText w:val="o"/>
+      <w:lvlJc w:val="left"/>
+      <w:pPr>
+        <w:tabs>
+          <w:tab w:val="num" w:pos="1440"/>
+        </w:tabs>
+        <w:ind w:left="1440" w:hanging="360"/>
+      </w:pPr>
+      <w:rPr>
+        <w:rFonts w:ascii="Courier New" w:hAnsi="Courier New" w:hint="default"/>
+        <w:sz w:val="20"/>
+      </w:rPr>
+    </w:lvl>
+    <w:lvl w:ilvl="2" w:tentative="1">
+      <w:start w:val="1"/>
+      <w:numFmt w:val="bullet"/>
+      <w:lvlText w:val=""/>
+      <w:lvlJc w:val="left"/>
+      <w:pPr>
+        <w:tabs>
+          <w:tab w:val="num" w:pos="2160"/>
+        </w:tabs>
+        <w:ind w:left="2160" w:hanging="360"/>
+      </w:pPr>
+      <w:rPr>
+        <w:rFonts w:ascii="Wingdings" w:hAnsi="Wingdings" w:hint="default"/>
+        <w:sz w:val="20"/>
+      </w:rPr>
+    </w:lvl>
+    <w:lvl w:ilvl="3" w:tentative="1">
+      <w:start w:val="1"/>
+      <w:numFmt w:val="bullet"/>
+      <w:lvlText w:val=""/>
+      <w:lvlJc w:val="left"/>
+      <w:pPr>
+        <w:tabs>
+          <w:tab w:val="num" w:pos="2880"/>
+        </w:tabs>
+        <w:ind w:left="2880" w:hanging="360"/>
+      </w:pPr>
+      <w:rPr>
+        <w:rFonts w:ascii="Wingdings" w:hAnsi="Wingdings" w:hint="default"/>
+        <w:sz w:val="20"/>
+      </w:rPr>
+    </w:lvl>
+    <w:lvl w:ilvl="4" w:tentative="1">
+      <w:start w:val="1"/>
+      <w:numFmt w:val="bullet"/>
+      <w:lvlText w:val=""/>
+      <w:lvlJc w:val="left"/>
+      <w:pPr>
+        <w:tabs>
+          <w:tab w:val="num" w:pos="3600"/>
+        </w:tabs>
+        <w:ind w:left="3600" w:hanging="360"/>
+      </w:pPr>
+      <w:rPr>
+        <w:rFonts w:ascii="Wingdings" w:hAnsi="Wingdings" w:hint="default"/>
+        <w:sz w:val="20"/>
+      </w:rPr>
+    </w:lvl>
+    <w:lvl w:ilvl="5" w:tentative="1">
+      <w:start w:val="1"/>
+      <w:numFmt w:val="bullet"/>
+      <w:lvlText w:val=""/>
+      <w:lvlJc w:val="left"/>
+      <w:pPr>
+        <w:tabs>
+          <w:tab w:val="num" w:pos="4320"/>
+        </w:tabs>
+        <w:ind w:left="4320" w:hanging="360"/>
+      </w:pPr>
+      <w:rPr>
+        <w:rFonts w:ascii="Wingdings" w:hAnsi="Wingdings" w:hint="default"/>
+        <w:sz w:val="20"/>
+      </w:rPr>
+    </w:lvl>
+    <w:lvl w:ilvl="6" w:tentative="1">
+      <w:start w:val="1"/>
+      <w:numFmt w:val="bullet"/>
+      <w:lvlText w:val=""/>
+      <w:lvlJc w:val="left"/>
+      <w:pPr>
+        <w:tabs>
+          <w:tab w:val="num" w:pos="5040"/>
+        </w:tabs>
+        <w:ind w:left="5040" w:hanging="360"/>
+      </w:pPr>
+      <w:rPr>
+        <w:rFonts w:ascii="Wingdings" w:hAnsi="Wingdings" w:hint="default"/>
+        <w:sz w:val="20"/>
+      </w:rPr>
+    </w:lvl>
+    <w:lvl w:ilvl="7" w:tentative="1">
+      <w:start w:val="1"/>
+      <w:numFmt w:val="bullet"/>
+      <w:lvlText w:val=""/>
+      <w:lvlJc w:val="left"/>
+      <w:pPr>
+        <w:tabs>
+          <w:tab w:val="num" w:pos="5760"/>
+        </w:tabs>
+        <w:ind w:left="5760" w:hanging="360"/>
+      </w:pPr>
+      <w:rPr>
+        <w:rFonts w:ascii="Wingdings" w:hAnsi="Wingdings" w:hint="default"/>
+        <w:sz w:val="20"/>
+      </w:rPr>
+    </w:lvl>
+    <w:lvl w:ilvl="8" w:tentative="1">
+      <w:start w:val="1"/>
+      <w:numFmt w:val="bullet"/>
+      <w:lvlText w:val=""/>
+      <w:lvlJc w:val="left"/>
+      <w:pPr>
+        <w:tabs>
+          <w:tab w:val="num" w:pos="6480"/>
+        </w:tabs>
+        <w:ind w:left="6480" w:hanging="360"/>
+      </w:pPr>
+      <w:rPr>
+        <w:rFonts w:ascii="Wingdings" w:hAnsi="Wingdings" w:hint="default"/>
+        <w:sz w:val="20"/>
+      </w:rPr>
+    </w:lvl>
+  </w:abstractNum>
+  <w:abstractNum w:abstractNumId="13">
     <w:nsid w:val="462362DD"/>
     <w:multiLevelType w:val="multilevel"/>
     <w:tmpl w:val="4A0E7666"/>
@@ -17272,7 +18795,7 @@
       </w:rPr>
     </w:lvl>
   </w:abstractNum>
-  <w:abstractNum w:abstractNumId="11">
+  <w:abstractNum w:abstractNumId="14">
     <w:nsid w:val="48AE774C"/>
     <w:multiLevelType w:val="multilevel"/>
     <w:tmpl w:val="FB8CBA8E"/>
@@ -17386,7 +18909,7 @@
       </w:rPr>
     </w:lvl>
   </w:abstractNum>
-  <w:abstractNum w:abstractNumId="12">
+  <w:abstractNum w:abstractNumId="15">
     <w:nsid w:val="55A431AF"/>
     <w:multiLevelType w:val="multilevel"/>
     <w:tmpl w:val="8690D806"/>
@@ -17500,7 +19023,7 @@
       </w:rPr>
     </w:lvl>
   </w:abstractNum>
-  <w:abstractNum w:abstractNumId="13">
+  <w:abstractNum w:abstractNumId="16">
     <w:nsid w:val="59071F8A"/>
     <w:multiLevelType w:val="multilevel"/>
     <w:tmpl w:val="56E274E8"/>
@@ -17614,7 +19137,156 @@
       </w:rPr>
     </w:lvl>
   </w:abstractNum>
-  <w:abstractNum w:abstractNumId="14">
+  <w:abstractNum w:abstractNumId="17">
+    <w:nsid w:val="5B464A1D"/>
+    <w:multiLevelType w:val="multilevel"/>
+    <w:tmpl w:val="F38E42C0"/>
+    <w:lvl w:ilvl="0">
+      <w:start w:val="1"/>
+      <w:numFmt w:val="bullet"/>
+      <w:lvlText w:val="-"/>
+      <w:lvlJc w:val="left"/>
+      <w:pPr>
+        <w:tabs>
+          <w:tab w:val="num" w:pos="720"/>
+        </w:tabs>
+        <w:ind w:left="720" w:hanging="360"/>
+      </w:pPr>
+      <w:rPr>
+        <w:rFonts w:ascii="Calibri" w:hAnsi="Calibri" w:hint="default"/>
+        <w:sz w:val="20"/>
+      </w:rPr>
+    </w:lvl>
+    <w:lvl w:ilvl="1">
+      <w:start w:val="1"/>
+      <w:numFmt w:val="bullet"/>
+      <w:lvlText w:val=""/>
+      <w:lvlJc w:val="left"/>
+      <w:pPr>
+        <w:tabs>
+          <w:tab w:val="num" w:pos="1440"/>
+        </w:tabs>
+        <w:ind w:left="1440" w:hanging="360"/>
+      </w:pPr>
+      <w:rPr>
+        <w:rFonts w:ascii="Symbol" w:hAnsi="Symbol" w:hint="default"/>
+        <w:sz w:val="20"/>
+      </w:rPr>
+    </w:lvl>
+    <w:lvl w:ilvl="2" w:tentative="1">
+      <w:start w:val="1"/>
+      <w:numFmt w:val="bullet"/>
+      <w:lvlText w:val=""/>
+      <w:lvlJc w:val="left"/>
+      <w:pPr>
+        <w:tabs>
+          <w:tab w:val="num" w:pos="2160"/>
+        </w:tabs>
+        <w:ind w:left="2160" w:hanging="360"/>
+      </w:pPr>
+      <w:rPr>
+        <w:rFonts w:ascii="Wingdings" w:hAnsi="Wingdings" w:hint="default"/>
+        <w:sz w:val="20"/>
+      </w:rPr>
+    </w:lvl>
+    <w:lvl w:ilvl="3" w:tentative="1">
+      <w:start w:val="1"/>
+      <w:numFmt w:val="bullet"/>
+      <w:lvlText w:val=""/>
+      <w:lvlJc w:val="left"/>
+      <w:pPr>
+        <w:tabs>
+          <w:tab w:val="num" w:pos="2880"/>
+        </w:tabs>
+        <w:ind w:left="2880" w:hanging="360"/>
+      </w:pPr>
+      <w:rPr>
+        <w:rFonts w:ascii="Wingdings" w:hAnsi="Wingdings" w:hint="default"/>
+        <w:sz w:val="20"/>
+      </w:rPr>
+    </w:lvl>
+    <w:lvl w:ilvl="4" w:tentative="1">
+      <w:start w:val="1"/>
+      <w:numFmt w:val="bullet"/>
+      <w:lvlText w:val=""/>
+      <w:lvlJc w:val="left"/>
+      <w:pPr>
+        <w:tabs>
+          <w:tab w:val="num" w:pos="3600"/>
+        </w:tabs>
+        <w:ind w:left="3600" w:hanging="360"/>
+      </w:pPr>
+      <w:rPr>
+        <w:rFonts w:ascii="Wingdings" w:hAnsi="Wingdings" w:hint="default"/>
+        <w:sz w:val="20"/>
+      </w:rPr>
+    </w:lvl>
+    <w:lvl w:ilvl="5" w:tentative="1">
+      <w:start w:val="1"/>
+      <w:numFmt w:val="bullet"/>
+      <w:lvlText w:val=""/>
+      <w:lvlJc w:val="left"/>
+      <w:pPr>
+        <w:tabs>
+          <w:tab w:val="num" w:pos="4320"/>
+        </w:tabs>
+        <w:ind w:left="4320" w:hanging="360"/>
+      </w:pPr>
+      <w:rPr>
+        <w:rFonts w:ascii="Wingdings" w:hAnsi="Wingdings" w:hint="default"/>
+        <w:sz w:val="20"/>
+      </w:rPr>
+    </w:lvl>
+    <w:lvl w:ilvl="6" w:tentative="1">
+      <w:start w:val="1"/>
+      <w:numFmt w:val="bullet"/>
+      <w:lvlText w:val=""/>
+      <w:lvlJc w:val="left"/>
+      <w:pPr>
+        <w:tabs>
+          <w:tab w:val="num" w:pos="5040"/>
+        </w:tabs>
+        <w:ind w:left="5040" w:hanging="360"/>
+      </w:pPr>
+      <w:rPr>
+        <w:rFonts w:ascii="Wingdings" w:hAnsi="Wingdings" w:hint="default"/>
+        <w:sz w:val="20"/>
+      </w:rPr>
+    </w:lvl>
+    <w:lvl w:ilvl="7" w:tentative="1">
+      <w:start w:val="1"/>
+      <w:numFmt w:val="bullet"/>
+      <w:lvlText w:val=""/>
+      <w:lvlJc w:val="left"/>
+      <w:pPr>
+        <w:tabs>
+          <w:tab w:val="num" w:pos="5760"/>
+        </w:tabs>
+        <w:ind w:left="5760" w:hanging="360"/>
+      </w:pPr>
+      <w:rPr>
+        <w:rFonts w:ascii="Wingdings" w:hAnsi="Wingdings" w:hint="default"/>
+        <w:sz w:val="20"/>
+      </w:rPr>
+    </w:lvl>
+    <w:lvl w:ilvl="8" w:tentative="1">
+      <w:start w:val="1"/>
+      <w:numFmt w:val="bullet"/>
+      <w:lvlText w:val=""/>
+      <w:lvlJc w:val="left"/>
+      <w:pPr>
+        <w:tabs>
+          <w:tab w:val="num" w:pos="6480"/>
+        </w:tabs>
+        <w:ind w:left="6480" w:hanging="360"/>
+      </w:pPr>
+      <w:rPr>
+        <w:rFonts w:ascii="Wingdings" w:hAnsi="Wingdings" w:hint="default"/>
+        <w:sz w:val="20"/>
+      </w:rPr>
+    </w:lvl>
+  </w:abstractNum>
+  <w:abstractNum w:abstractNumId="18">
     <w:nsid w:val="63BE33A6"/>
     <w:multiLevelType w:val="hybridMultilevel"/>
     <w:tmpl w:val="31340CF4"/>
@@ -17727,7 +19399,7 @@
       </w:rPr>
     </w:lvl>
   </w:abstractNum>
-  <w:abstractNum w:abstractNumId="15">
+  <w:abstractNum w:abstractNumId="19">
     <w:nsid w:val="649C7789"/>
     <w:multiLevelType w:val="multilevel"/>
     <w:tmpl w:val="2248AD76"/>
@@ -17841,7 +19513,7 @@
       </w:rPr>
     </w:lvl>
   </w:abstractNum>
-  <w:abstractNum w:abstractNumId="16">
+  <w:abstractNum w:abstractNumId="20">
     <w:nsid w:val="67CF3E51"/>
     <w:multiLevelType w:val="hybridMultilevel"/>
     <w:tmpl w:val="AE6E57E8"/>
@@ -17954,7 +19626,7 @@
       </w:rPr>
     </w:lvl>
   </w:abstractNum>
-  <w:abstractNum w:abstractNumId="17">
+  <w:abstractNum w:abstractNumId="21">
     <w:nsid w:val="693F6802"/>
     <w:multiLevelType w:val="multilevel"/>
     <w:tmpl w:val="E4F06D18"/>
@@ -18068,7 +19740,7 @@
       </w:rPr>
     </w:lvl>
   </w:abstractNum>
-  <w:abstractNum w:abstractNumId="18">
+  <w:abstractNum w:abstractNumId="22">
     <w:nsid w:val="6B520411"/>
     <w:multiLevelType w:val="multilevel"/>
     <w:tmpl w:val="373C6680"/>
@@ -18217,7 +19889,7 @@
       </w:rPr>
     </w:lvl>
   </w:abstractNum>
-  <w:abstractNum w:abstractNumId="19">
+  <w:abstractNum w:abstractNumId="23">
     <w:nsid w:val="6BE46AD7"/>
     <w:multiLevelType w:val="multilevel"/>
     <w:tmpl w:val="EAF2CF18"/>
@@ -18366,7 +20038,7 @@
       </w:rPr>
     </w:lvl>
   </w:abstractNum>
-  <w:abstractNum w:abstractNumId="20">
+  <w:abstractNum w:abstractNumId="24">
     <w:nsid w:val="7E8F14C9"/>
     <w:multiLevelType w:val="multilevel"/>
     <w:tmpl w:val="4DC630FC"/>
@@ -18516,61 +20188,61 @@
     </w:lvl>
   </w:abstractNum>
   <w:num w:numId="1">
-    <w:abstractNumId w:val="10"/>
+    <w:abstractNumId w:val="13"/>
   </w:num>
   <w:num w:numId="2">
-    <w:abstractNumId w:val="12"/>
+    <w:abstractNumId w:val="15"/>
   </w:num>
   <w:num w:numId="3">
     <w:abstractNumId w:val="1"/>
   </w:num>
   <w:num w:numId="4">
+    <w:abstractNumId w:val="8"/>
+  </w:num>
+  <w:num w:numId="5">
+    <w:abstractNumId w:val="16"/>
+  </w:num>
+  <w:num w:numId="6">
+    <w:abstractNumId w:val="9"/>
+  </w:num>
+  <w:num w:numId="7">
     <w:abstractNumId w:val="7"/>
   </w:num>
-  <w:num w:numId="5">
-    <w:abstractNumId w:val="13"/>
-  </w:num>
-  <w:num w:numId="6">
-    <w:abstractNumId w:val="8"/>
-  </w:num>
-  <w:num w:numId="7">
-    <w:abstractNumId w:val="6"/>
-  </w:num>
   <w:num w:numId="8">
-    <w:abstractNumId w:val="17"/>
+    <w:abstractNumId w:val="21"/>
   </w:num>
   <w:num w:numId="9">
-    <w:abstractNumId w:val="15"/>
+    <w:abstractNumId w:val="19"/>
   </w:num>
   <w:num w:numId="10">
     <w:abstractNumId w:val="0"/>
   </w:num>
   <w:num w:numId="11">
-    <w:abstractNumId w:val="11"/>
+    <w:abstractNumId w:val="14"/>
   </w:num>
   <w:num w:numId="12">
     <w:abstractNumId w:val="2"/>
   </w:num>
   <w:num w:numId="13">
-    <w:abstractNumId w:val="14"/>
+    <w:abstractNumId w:val="18"/>
   </w:num>
   <w:num w:numId="14">
+    <w:abstractNumId w:val="24"/>
+  </w:num>
+  <w:num w:numId="15">
     <w:abstractNumId w:val="20"/>
   </w:num>
-  <w:num w:numId="15">
-    <w:abstractNumId w:val="16"/>
-  </w:num>
   <w:num w:numId="16">
-    <w:abstractNumId w:val="5"/>
+    <w:abstractNumId w:val="6"/>
   </w:num>
   <w:num w:numId="17">
-    <w:abstractNumId w:val="18"/>
+    <w:abstractNumId w:val="22"/>
   </w:num>
   <w:num w:numId="18">
-    <w:abstractNumId w:val="9"/>
+    <w:abstractNumId w:val="10"/>
   </w:num>
   <w:num w:numId="19">
-    <w:abstractNumId w:val="4"/>
+    <w:abstractNumId w:val="5"/>
     <w:lvlOverride w:ilvl="0">
       <w:lvl w:ilvl="0">
         <w:numFmt w:val="bullet"/>
@@ -18590,10 +20262,22 @@
     </w:lvlOverride>
   </w:num>
   <w:num w:numId="20">
-    <w:abstractNumId w:val="19"/>
+    <w:abstractNumId w:val="23"/>
   </w:num>
   <w:num w:numId="21">
     <w:abstractNumId w:val="3"/>
+  </w:num>
+  <w:num w:numId="22">
+    <w:abstractNumId w:val="17"/>
+  </w:num>
+  <w:num w:numId="23">
+    <w:abstractNumId w:val="11"/>
+  </w:num>
+  <w:num w:numId="24">
+    <w:abstractNumId w:val="12"/>
+  </w:num>
+  <w:num w:numId="25">
+    <w:abstractNumId w:val="4"/>
   </w:num>
 </w:numbering>
 </file>
@@ -19549,6 +21233,19 @@
       <w:bCs/>
     </w:rPr>
   </w:style>
+  <w:style w:type="paragraph" w:customStyle="1" w:styleId="font-claude-response-body">
+    <w:name w:val="font-claude-response-body"/>
+    <w:basedOn w:val="Normal"/>
+    <w:rsid w:val="00F21D70"/>
+    <w:pPr>
+      <w:spacing w:before="100" w:beforeAutospacing="1" w:after="100" w:afterAutospacing="1" w:line="240" w:lineRule="auto"/>
+    </w:pPr>
+    <w:rPr>
+      <w:rFonts w:ascii="Times New Roman" w:eastAsia="Times New Roman" w:hAnsi="Times New Roman" w:cs="Times New Roman"/>
+      <w:sz w:val="24"/>
+      <w:szCs w:val="24"/>
+    </w:rPr>
+  </w:style>
 </w:styles>
 </file>
 

</xml_diff>